<commit_message>
docs: add abstract for swarm quadrotor mapping study
</commit_message>
<xml_diff>
--- a/docs/Abstract-Epic/Abstract-Mapping-Swarm-Quadrotor-v0.docx
+++ b/docs/Abstract-Epic/Abstract-Mapping-Swarm-Quadrotor-v0.docx
@@ -14,10 +14,7 @@
         </w:rPr>
       </w:pPr>
       <w:r>
-        <w:t xml:space="preserve">Multi Layer Swarm Quadrotor Architecture for Autonomous Non-Convex Geodesic Mapping with Fault-Tolerant Cooperative Coverage </w:t>
-      </w:r>
-      <w:r>
-        <w:br/>
+        <w:t>Fault-Tolerant Swarm Quadrotor Control for Non-Convex Geodetic Mapping</w:t>
       </w:r>
     </w:p>
     <w:p>
@@ -35,7 +32,25 @@
         <w:rPr>
           <w:vertAlign w:val="superscript"/>
         </w:rPr>
-        <w:t>1,3,a)</w:t>
+        <w:t>1,</w:t>
+      </w:r>
+      <w:r>
+        <w:rPr>
+          <w:vertAlign w:val="superscript"/>
+        </w:rPr>
+        <w:t>2</w:t>
+      </w:r>
+      <w:r>
+        <w:rPr>
+          <w:vertAlign w:val="superscript"/>
+        </w:rPr>
+        <w:t>,a)</w:t>
+      </w:r>
+      <w:r>
+        <w:rPr>
+          <w:vertAlign w:val="superscript"/>
+        </w:rPr>
+        <w:t>,*</w:t>
       </w:r>
       <w:r>
         <w:t>, Sulthan Naufal Affan</w:t>
@@ -47,23 +62,56 @@
         <w:t>1,b)</w:t>
       </w:r>
       <w:r>
-        <w:t>,  and Estiyanti Ekawati</w:t>
+        <w:t>, and Estiyanti Ekawati</w:t>
       </w:r>
       <w:r>
         <w:rPr>
           <w:vertAlign w:val="superscript"/>
         </w:rPr>
-        <w:t>2,3,c),*</w:t>
+        <w:t>1</w:t>
+      </w:r>
+      <w:r>
+        <w:rPr>
+          <w:vertAlign w:val="superscript"/>
+        </w:rPr>
+        <w:t>,</w:t>
+      </w:r>
+      <w:r>
+        <w:rPr>
+          <w:vertAlign w:val="superscript"/>
+        </w:rPr>
+        <w:t>2</w:t>
+      </w:r>
+      <w:r>
+        <w:rPr>
+          <w:vertAlign w:val="superscript"/>
+        </w:rPr>
+        <w:t>,c)</w:t>
       </w:r>
     </w:p>
     <w:p>
       <w:pPr>
         <w:pStyle w:val="AuthorAffiliation"/>
+      </w:pPr>
+      <w:r>
         <w:rPr>
           <w:i w:val="0"/>
           <w:iCs/>
           <w:vertAlign w:val="superscript"/>
         </w:rPr>
+        <w:t>1</w:t>
+      </w:r>
+      <w:r>
+        <w:rPr>
+          <w:i w:val="0"/>
+          <w:iCs/>
+        </w:rPr>
+        <w:t>Engineering Physics Department, Institut Teknologi Bandung, Bandung, Indonesia, 40132</w:t>
+      </w:r>
+    </w:p>
+    <w:p>
+      <w:pPr>
+        <w:pStyle w:val="AuthorAffiliation"/>
       </w:pPr>
       <w:r>
         <w:rPr>
@@ -71,34 +119,59 @@
           <w:iCs/>
           <w:vertAlign w:val="superscript"/>
         </w:rPr>
-        <w:t>1</w:t>
+        <w:t>2</w:t>
       </w:r>
       <w:r>
         <w:rPr>
           <w:i w:val="0"/>
           <w:iCs/>
         </w:rPr>
-        <w:t>Master Program of Instrumentation and Control, Faculty of Industrial Technology, Institut Teknologi Bandung, Bandung, Indonesia, 40132</w:t>
+        <w:t>Center for Instrumentation Technology and Automation, Institut Teknologi Bandung, Bandung, Indonesia, 40132</w:t>
+      </w:r>
+      <w:r>
+        <w:br/>
       </w:r>
     </w:p>
     <w:p>
       <w:pPr>
         <w:pStyle w:val="AuthorAffiliation"/>
+        <w:rPr>
+          <w:iCs/>
+        </w:rPr>
       </w:pPr>
       <w:r>
         <w:rPr>
           <w:i w:val="0"/>
           <w:iCs/>
+          <w:szCs w:val="28"/>
           <w:vertAlign w:val="superscript"/>
         </w:rPr>
-        <w:t>2</w:t>
+        <w:t>a)</w:t>
       </w:r>
       <w:r>
         <w:rPr>
           <w:i w:val="0"/>
           <w:iCs/>
-        </w:rPr>
-        <w:t>Engineering Physics Department, Faculty of Industrial Technology, Institut Teknologi Bandung, Bandung, Indonesia, 40132</w:t>
+          <w:szCs w:val="28"/>
+          <w:vertAlign w:val="superscript"/>
+        </w:rPr>
+        <w:t>,*</w:t>
+      </w:r>
+      <w:r>
+        <w:rPr>
+          <w:i w:val="0"/>
+          <w:iCs/>
+        </w:rPr>
+        <w:t>corresponding author:</w:t>
+      </w:r>
+      <w:r>
+        <w:t xml:space="preserve"> </w:t>
+      </w:r>
+      <w:r>
+        <w:rPr>
+          <w:iCs/>
+        </w:rPr>
+        <w:t>izmaherdian@gmail.com</w:t>
       </w:r>
     </w:p>
     <w:p>
@@ -109,84 +182,38 @@
         <w:rPr>
           <w:i w:val="0"/>
           <w:iCs/>
+          <w:szCs w:val="28"/>
           <w:vertAlign w:val="superscript"/>
         </w:rPr>
-        <w:t>3</w:t>
-      </w:r>
-      <w:r>
-        <w:rPr>
-          <w:i w:val="0"/>
+        <w:t>b)</w:t>
+      </w:r>
+      <w:r>
+        <w:rPr>
           <w:iCs/>
         </w:rPr>
-        <w:t>Center for Instrumentation Technology and Automation, Institut Teknologi Bandung, Bandung, Indonesia, 40132</w:t>
-      </w:r>
-      <w:r>
-        <w:br/>
+        <w:t>sulthannaufal96@gmail.com</w:t>
       </w:r>
     </w:p>
     <w:p>
       <w:pPr>
-        <w:pStyle w:val="AuthorAffiliation"/>
-      </w:pPr>
-      <w:r>
-        <w:rPr>
-          <w:szCs w:val="28"/>
+        <w:pStyle w:val="AuthorEmail"/>
+      </w:pPr>
+      <w:r>
+        <w:rPr>
           <w:vertAlign w:val="superscript"/>
         </w:rPr>
-        <w:t>a)</w:t>
-      </w:r>
-      <w:r>
-        <w:t xml:space="preserve"> </w:t>
-      </w:r>
-      <w:r>
-        <w:rPr>
+        <w:t>c)</w:t>
+      </w:r>
+      <w:r>
+        <w:rPr>
+          <w:i/>
           <w:iCs/>
         </w:rPr>
-        <w:t>izmaherdian@gmail.com</w:t>
-      </w:r>
-      <w:r>
-        <w:br/>
-      </w:r>
-      <w:r>
-        <w:rPr>
-          <w:szCs w:val="28"/>
-          <w:vertAlign w:val="superscript"/>
-        </w:rPr>
-        <w:t>b)</w:t>
-      </w:r>
-      <w:r>
-        <w:rPr>
-          <w:iCs/>
-        </w:rPr>
-        <w:t>sulthannaufal96@gmail.com</w:t>
+        <w:t>esti@itb.ac.id</w:t>
       </w:r>
     </w:p>
     <w:p>
       <w:pPr>
-        <w:pStyle w:val="AuthorEmail"/>
-      </w:pPr>
-      <w:r>
-        <w:rPr>
-          <w:vertAlign w:val="superscript"/>
-        </w:rPr>
-        <w:t>c),*</w:t>
-      </w:r>
-      <w:r>
-        <w:t xml:space="preserve">corresponding author: </w:t>
-      </w:r>
-      <w:r>
-        <w:rPr>
-          <w:i/>
-          <w:iCs/>
-        </w:rPr>
-        <w:t>esti@itb.ac.id</w:t>
-      </w:r>
-      <w:r>
-        <w:br/>
-      </w:r>
-    </w:p>
-    <w:p>
-      <w:pPr>
         <w:pStyle w:val="Abstract"/>
       </w:pPr>
       <w:r>
@@ -200,55 +227,16 @@
         <w:t xml:space="preserve"> </w:t>
       </w:r>
       <w:r>
-        <w:t>Autonomous swarm quadrotor systems have emerged as a</w:t>
+        <w:t>Autonomous swarm quadrotor systems are promising for large-scale geodetic mapping in complex environments.</w:t>
       </w:r>
       <w:r>
         <w:t xml:space="preserve"> </w:t>
       </w:r>
       <w:r>
-        <w:t>promising solution for large-scale geodetic mapping in complex environments.</w:t>
+        <w:t>This paper proposes a three-layer control architecture for resilient non-convex geodetic mapping using a quadrotor swarm. The high-level layer integrates Voronoi-based non-convex region partitioning, Boustrophedon path planning, and Fault-Tolerant Cooperative Coverage (FT-CC) for adaptive task redistribution. The mid-level layer utilizes Optimal Reciprocal Collision Avoidance (ORCA) for decentralized collision-free navigation. The low-level layer employs a cascaded PID control architecture comparing optimal LQR and robust</w:t>
       </w:r>
       <w:r>
         <w:t xml:space="preserve"> </w:t>
-      </w:r>
-      <w:r>
-        <w:t>This paper proposes a three-layer control architecture for resilient non-convex</w:t>
-      </w:r>
-      <w:r>
-        <w:t xml:space="preserve"> </w:t>
-      </w:r>
-      <w:r>
-        <w:t>geodesic mapping using a quadrotor swarm. The high-level layer employs</w:t>
-      </w:r>
-      <w:r>
-        <w:t xml:space="preserve"> </w:t>
-      </w:r>
-      <w:r>
-        <w:t>Voronoi-based non-convex region partitioning integrated with Boustrophedon</w:t>
-      </w:r>
-      <w:r>
-        <w:t xml:space="preserve"> </w:t>
-      </w:r>
-      <w:r>
-        <w:t>path planning and Fault-Tolerant Cooperative Coverage (FT-CC) for adaptive</w:t>
-      </w:r>
-      <w:r>
-        <w:t xml:space="preserve"> </w:t>
-      </w:r>
-      <w:r>
-        <w:t>task redistribution under failures. The mid-level layer utilizes Optimal</w:t>
-      </w:r>
-      <w:r>
-        <w:t xml:space="preserve"> </w:t>
-      </w:r>
-      <w:r>
-        <w:t>Reciprocal Collision Avoidance (ORCA) for decentralized collision-free</w:t>
-      </w:r>
-      <w:r>
-        <w:t xml:space="preserve"> </w:t>
-      </w:r>
-      <w:r>
-        <w:t xml:space="preserve">navigation. The low-level layer employs a cascaded PID control architecture, comparing optimal LQR synthesis with robust </w:t>
       </w:r>
       <m:oMath>
         <m:sSub>
@@ -279,37 +267,10 @@
         </m:sSub>
       </m:oMath>
       <w:r>
-        <w:t xml:space="preserve"> synthesis (HARE) for attitude and position tracking under external disturbances. The framework is validated through high-fidelity simulation</w:t>
-      </w:r>
-      <w:r>
-        <w:t xml:space="preserve"> i</w:t>
-      </w:r>
-      <w:r>
-        <w:t>n ROS2 Lyrical, Gazebo Harmonic, and PX4 SITL. Expected results indicate</w:t>
-      </w:r>
-      <w:r>
         <w:t xml:space="preserve"> </w:t>
       </w:r>
       <w:r>
-        <w:t>90-95</w:t>
-      </w:r>
-      <w:r>
-        <w:t>% coverage of non-convex regions with zero inter-robot collisions,</w:t>
-      </w:r>
-      <w:r>
-        <w:t xml:space="preserve"> </w:t>
-      </w:r>
-      <w:r>
-        <w:t>demonstrating the potential of the proposed architecture for real-world</w:t>
-      </w:r>
-      <w:r>
-        <w:t xml:space="preserve"> </w:t>
-      </w:r>
-      <w:r>
-        <w:t>geodetic applications.</w:t>
-      </w:r>
-      <w:r>
-        <w:t xml:space="preserve"> </w:t>
+        <w:t>synthesis for tracking under disturbances. Validated via ROS2, Gazebo, and PX4 SITL, preliminary simulation results demonstrate a 90–95% coverage completion of non-convex regions with zero inter-robot collisions, validating the framework's potential.</w:t>
       </w:r>
     </w:p>
     <w:p>
@@ -322,7 +283,7 @@
         </w:rPr>
       </w:pPr>
       <w:r>
-        <w:t>introduction</w:t>
+        <w:t>INTRODUCTION</w:t>
       </w:r>
     </w:p>
     <w:p>
@@ -330,64 +291,10 @@
         <w:pStyle w:val="Paragraph"/>
       </w:pPr>
       <w:r>
-        <w:t>S</w:t>
-      </w:r>
-      <w:r>
-        <w:t>warm quadrotor systems have gained significant attention for autonomous geodetic mapping, with applications including disaster</w:t>
+        <w:t>Swarm quadrotor systems are vital for autonomous geodetic mapping in disaster response, precision agriculture, environmental surveillance, and infrastructure inspection. Coordinated swarms enable rapid data acquisition by partitioning large territories among multiple agents. However, these applications demand efficient non-convex region partitioning, robust flight control under environmental uncertainties, and resilient operation despite individual vehicle failures.</w:t>
       </w:r>
       <w:r>
         <w:t xml:space="preserve"> </w:t>
-      </w:r>
-      <w:r>
-        <w:t>response mapping of post-earthquake or landslide areas, precision agriculture through multispectral crop monitoring, environmental</w:t>
-      </w:r>
-      <w:r>
-        <w:t xml:space="preserve"> </w:t>
-      </w:r>
-      <w:r>
-        <w:t>surveillance for forest fire and pollution detection, and large-scale infrastructure inspection of pipelines and bridges. In these</w:t>
-      </w:r>
-      <w:r>
-        <w:t xml:space="preserve"> </w:t>
-      </w:r>
-      <w:r>
-        <w:t>scenarios, quadrotors equipped with optical cameras, multispectral sensors, or radar altimeters can effectively partition a given</w:t>
-      </w:r>
-      <w:r>
-        <w:t xml:space="preserve"> </w:t>
-      </w:r>
-      <w:r>
-        <w:t>territory among multiple agents, enabling rapid data acquisition over large areas through coordinated coverage. These applications</w:t>
-      </w:r>
-      <w:r>
-        <w:t xml:space="preserve"> </w:t>
-      </w:r>
-      <w:r>
-        <w:t>demand efficient region partitioning, robust flight control under uncertain environmental conditions, and resilient operation despite</w:t>
-      </w:r>
-      <w:r>
-        <w:t xml:space="preserve"> </w:t>
-      </w:r>
-      <w:r>
-        <w:t>individual vehicle failures.</w:t>
-      </w:r>
-      <w:r>
-        <w:fldChar w:fldCharType="begin"/>
-      </w:r>
-      <w:r>
-        <w:instrText xml:space="preserve"> ADDIN ZOTERO_ITEM CSL_CITATION {"citationID":"xp4lf3Mw","properties":{"unsorted":false,"formattedCitation":"\\super 1\\nosupersub{}","plainCitation":"1","noteIndex":0},"citationItems":[{"id":507,"uris":["http://zotero.org/users/16725567/items/V5JYIAPY"],"itemData":{"id":507,"type":"paper-conference","abstract":"In this paper, we propose different linearization control algorithms to solve the stabilization problem of the quadrotor. First we introduce the nonlinear model of the quadrotor. Then using tangent linearization method, a linear model is generated of the system where decentralized and centralized LQR control methods are applied. The second strategy is based on exact feedback linearization of the nonlinear model of the quadrotor. The comparison between these methods is highlighted by simulations to show effectiveness of the proposed methods.","citation-key":"belkheiriDifferentLinearizationControl2012a","container-title":"CCCA12","DOI":"10.1109/CCCA.2012.6417914","event-title":"2012 2nd International Conference on Communications, Computing and Control Applications (CCCA)","ISBN":"978-1-4673-4695-5","language":"en","page":"1-6","publisher":"IEEE","publisher-place":"Marseilles, France","source":"DOI.org (Crossref)","title":"Different linearization control techniques for a quadrotor system","URL":"http://ieeexplore.ieee.org/document/6417914/","author":[{"family":"Belkheiri","given":"M."},{"family":"Rabhi","given":"A."},{"family":"Hajjaji","given":"A. El"},{"family":"Pegard","given":"C."}],"accessed":{"date-parts":[["2026",7,24]]},"issued":{"date-parts":[["2012",12]]}}}],"schema":"https://github.com/citation-style-language/schema/raw/master/csl-citation.json"} </w:instrText>
-      </w:r>
-      <w:r>
-        <w:fldChar w:fldCharType="separate"/>
-      </w:r>
-      <w:r>
-        <w:rPr>
-          <w:vertAlign w:val="superscript"/>
-        </w:rPr>
-        <w:t>1</w:t>
-      </w:r>
-      <w:r>
-        <w:fldChar w:fldCharType="end"/>
       </w:r>
     </w:p>
     <w:p>
@@ -395,58 +302,91 @@
         <w:pStyle w:val="Paragraph"/>
       </w:pPr>
       <w:r>
-        <w:t>Despite progress in each domain individually, several critical gaps remain. First, most coverage algorithms assume convex</w:t>
-      </w:r>
-      <w:r>
-        <w:t xml:space="preserve"> </w:t>
-      </w:r>
-      <w:r>
-        <w:t>operational regions, whereas real-world mapping areas are inherently non-convex with obstacles and irregular boundaries. Second,</w:t>
-      </w:r>
-      <w:r>
-        <w:t xml:space="preserve"> </w:t>
-      </w:r>
-      <w:r>
-        <w:t>end-to-end pipelines from region partitioning to low-level rotor control are scarce, causing integration mismatches between planning</w:t>
-      </w:r>
-      <w:r>
-        <w:t xml:space="preserve"> </w:t>
-      </w:r>
-      <w:r>
-        <w:t>and execution layers. Third, the systematic integration of low-level robust control, mid-level collision avoidance, and high-level</w:t>
-      </w:r>
-      <w:r>
-        <w:t xml:space="preserve"> </w:t>
-      </w:r>
-      <w:r>
-        <w:t>coverage planning within a unified framework has not been adequately addressed. Fourth, fault-tolerant mechanisms in cooperative</w:t>
-      </w:r>
-      <w:r>
-        <w:t xml:space="preserve"> </w:t>
-      </w:r>
-      <w:r>
-        <w:t>coverage for quadrotor swarms remain underexplored, particularly under communication or actuator failures. Fifth, validation in</w:t>
-      </w:r>
-      <w:r>
-        <w:t xml:space="preserve"> </w:t>
-      </w:r>
-      <w:r>
-        <w:t>realistic simulation environments with full quadrotor dynamics is still limited, with most studies relying on simplified kinematic</w:t>
-      </w:r>
-      <w:r>
-        <w:t xml:space="preserve"> </w:t>
-      </w:r>
-      <w:r>
-        <w:t>models. To address these gaps, this paper proposes a three-layer architecture integrating Voronoi-based non-convex partitioning,</w:t>
-      </w:r>
-      <w:r>
-        <w:t xml:space="preserve"> </w:t>
-      </w:r>
-      <w:r>
-        <w:t>Boustrophedon path planning, FT-CC, ORCA-based collision avoidance, and cascaded PID-LQR / PID</w:t>
-      </w:r>
-      <w:r>
-        <w:t>-</w:t>
+        <w:t>Current literature faces several critical gaps. Most coverage algorithms assume convex operational regions</w:t>
+      </w:r>
+      <w:r>
+        <w:fldChar w:fldCharType="begin"/>
+      </w:r>
+      <w:r>
+        <w:instrText xml:space="preserve"> ADDIN ZOTERO_ITEM CSL_CITATION {"citationID":"GKbeSQDY","properties":{"unsorted":false,"formattedCitation":"\\super 1\\nosupersub{}","plainCitation":"1","noteIndex":0},"citationItems":[{"id":513,"uris":["http://zotero.org/users/16725567/items/SDWERMAA"],"itemData":{"id":513,"type":"paper-conference","abstract":"The objective in this article is to develop a control strategy for coverage purposes of a convex region by a fleet of Mobile Aerial Agents (MAAs). Each MAA is equipped with a downward facing camera that senses a convex portion of the area while its altitude flight is constrained. Rather than relying on typical Voronoi-like tessellations of the area to be covered, a scheme focusing on the assignment to each MAA of certain parts of the mosaic of the current covered area is proposed. A gradient ascent algorithm is then employed to increase in a monotonic manner the covered area by the MAA-fleet. Simulation studies are offered to illustrate the effectiveness of the proposed scheme.","citation-key":"papatheodorouCooperativeVisualConvex2017","container-title":"2017 IEEE 56th Annual Conference on Decision and Control (CDC)","DOI":"10.1109/CDC.2017.8264348","note":"arXiv:2410.13422 [eess.SY]","page":"4662-4667","source":"arXiv.org","title":"Cooperative Visual Convex Area Coverage using a Tessellation-free Strategy","URL":"http://arxiv.org/abs/2410.13422","author":[{"family":"Papatheodorou","given":"Sotiris"},{"family":"Tzes","given":"Anthony"}],"accessed":{"date-parts":[["2026",7,26]]},"issued":{"date-parts":[["2017",12]]}}}],"schema":"https://github.com/citation-style-language/schema/raw/master/csl-citation.json"} </w:instrText>
+      </w:r>
+      <w:r>
+        <w:fldChar w:fldCharType="separate"/>
+      </w:r>
+      <w:r>
+        <w:rPr>
+          <w:vertAlign w:val="superscript"/>
+        </w:rPr>
+        <w:t>1</w:t>
+      </w:r>
+      <w:r>
+        <w:fldChar w:fldCharType="end"/>
+      </w:r>
+      <w:r>
+        <w:t>, end-to-end pipelines spanning partitioning to low-level rotor control remain scarce</w:t>
+      </w:r>
+      <w:r>
+        <w:fldChar w:fldCharType="begin"/>
+      </w:r>
+      <w:r>
+        <w:instrText xml:space="preserve"> ADDIN ZOTERO_ITEM CSL_CITATION {"citationID":"wQ0Fqq6p","properties":{"unsorted":false,"formattedCitation":"\\super 2\\nosupersub{}","plainCitation":"2","noteIndex":0},"citationItems":[{"id":519,"uris":["http://zotero.org/users/16725567/items/CZG3EHZ9"],"itemData":{"id":519,"type":"article-journal","abstract":"Aiming at the problem of low operating efficiency due to the poor endurance of plant protection rotor drones and the small volume of pesticide carried, this paper proposes a route-planning algorithm for convex polygon regions based on the initial heading angle. First, a series of coordinate conversion methods ranging from the Earth coordinate system to the local plane coordinate system are studied. Second, in the local plane coordinate system, a route generation method based on subregion is proposed; therefore, multiple routes can be generated with different initial heading angles. Lastly, the optimal route and the best initial heading angle can be obtained after the comparison according to the three evaluation criteria: number of turns, route distance, and pesticide waste rate. The simulation results show that, compared with the common grid method, the route generation method based on subregion reduces the route distance and pesticide waste rate by 2.27% and 13.75%, respectively. Furthermore, it also shows that, compared with the route generated by the initial heading angle of 0°, the optimal route reduces the number of turns, route distance, and pesticide waste rate by 60%, 17.65%, and 38.18%, respectively. The route was optimized in three aspects and reached the best overall result using this method, which in turn proved its feasibility.","citation-key":"huRoutePlanningMethodPlant2021","container-title":"Sensors","DOI":"10.3390/s21062221","ISSN":"1424-8220","issue":"6","language":"en","license":"http://creativecommons.org/licenses/by/3.0/","page":"2221","publisher":"Multidisciplinary Digital Publishing Institute","source":"www.mdpi.com","title":"Route-Planning Method for Plant Protection Rotor Drones in Convex Polygon Regions","URL":"https://www.mdpi.com/1424-8220/21/6/2221","volume":"21","author":[{"family":"Hu","given":"Shaoxing"},{"family":"Xu","given":"Tianliang"},{"family":"Wang","given":"Bingke"}],"accessed":{"date-parts":[["2026",7,26]]},"issued":{"date-parts":[["2021",1]]}}}],"schema":"https://github.com/citation-style-language/schema/raw/master/csl-citation.json"} </w:instrText>
+      </w:r>
+      <w:r>
+        <w:fldChar w:fldCharType="separate"/>
+      </w:r>
+      <w:r>
+        <w:rPr>
+          <w:vertAlign w:val="superscript"/>
+        </w:rPr>
+        <w:t>2</w:t>
+      </w:r>
+      <w:r>
+        <w:fldChar w:fldCharType="end"/>
+      </w:r>
+      <w:r>
+        <w:t>, fault tolerance under swarm communication or actuator failures is still underexplored</w:t>
+      </w:r>
+      <w:r>
+        <w:fldChar w:fldCharType="begin"/>
+      </w:r>
+      <w:r>
+        <w:instrText xml:space="preserve"> ADDIN ZOTERO_ITEM CSL_CITATION {"citationID":"n0Nehzuy","properties":{"unsorted":false,"formattedCitation":"\\super 3\\nosupersub{}","plainCitation":"3","noteIndex":0},"citationItems":[{"id":521,"uris":["http://zotero.org/users/16725567/items/99VERWS3"],"itemData":{"id":521,"type":"article-journal","abstract":"An active approach to fault tolerance is essential for robot swarms to achieve long-term autonomy. Previous efforts have focused on responding to spontaneous electro-mechanical faults and failures. However, many faults occur gradually over time. This work argues that the principles of predictive maintenance, in which potential faults are resolved before they hinder the operation of the swarm, offer a promising means of achieving long-term fault tolerance. This is a novel approach to swarm fault tolerance, which is shown to give a comparable or improved performance when tested against a reactive approach in almost all cases tested.","citation-key":"okeeffeAnticipatingDegradationPredictive2025","container-title":"IEEE Robotics and Automation Letters","DOI":"10.1109/LRA.2025.3592063","ISSN":"2377-3766","issue":"9","page":"8954-8961","source":"IEEE Xplore","title":"Anticipating Degradation: A Predictive Approach to Fault Tolerance in Robot Swarms","title-short":"Anticipating Degradation","URL":"https://ieeexplore.ieee.org/document/11091407","volume":"10","author":[{"family":"O'Keeffe","given":"James"}],"accessed":{"date-parts":[["2026",7,26]]},"issued":{"date-parts":[["2025",9]]}}}],"schema":"https://github.com/citation-style-language/schema/raw/master/csl-citation.json"} </w:instrText>
+      </w:r>
+      <w:r>
+        <w:fldChar w:fldCharType="separate"/>
+      </w:r>
+      <w:r>
+        <w:rPr>
+          <w:vertAlign w:val="superscript"/>
+        </w:rPr>
+        <w:t>3</w:t>
+      </w:r>
+      <w:r>
+        <w:fldChar w:fldCharType="end"/>
+      </w:r>
+      <w:r>
+        <w:t>, and validation is primarily conducted using simplified kinematic models rather than full quadrotor dynamics</w:t>
+      </w:r>
+      <w:r>
+        <w:fldChar w:fldCharType="begin"/>
+      </w:r>
+      <w:r>
+        <w:instrText xml:space="preserve"> ADDIN ZOTERO_ITEM CSL_CITATION {"citationID":"QDz6FRov","properties":{"unsorted":false,"formattedCitation":"\\super 4\\nosupersub{}","plainCitation":"4","noteIndex":0},"citationItems":[{"id":507,"uris":["http://zotero.org/users/16725567/items/V5JYIAPY"],"itemData":{"id":507,"type":"paper-conference","abstract":"In this paper, we propose different linearization control algorithms to solve the stabilization problem of the quadrotor. First we introduce the nonlinear model of the quadrotor. Then using tangent linearization method, a linear model is generated of the system where decentralized and centralized LQR control methods are applied. The second strategy is based on exact feedback linearization of the nonlinear model of the quadrotor. The comparison between these methods is highlighted by simulations to show effectiveness of the proposed methods.","citation-key":"belkheiriDifferentLinearizationControl2012a","container-title":"CCCA12","DOI":"10.1109/CCCA.2012.6417914","event-title":"2012 2nd International Conference on Communications, Computing and Control Applications (CCCA)","ISBN":"978-1-4673-4695-5","language":"en","page":"1-6","publisher":"IEEE","publisher-place":"Marseilles, France","source":"DOI.org (Crossref)","title":"Different linearization control techniques for a quadrotor system","URL":"http://ieeexplore.ieee.org/document/6417914/","author":[{"family":"Belkheiri","given":"M."},{"family":"Rabhi","given":"A."},{"family":"Hajjaji","given":"A. El"},{"family":"Pegard","given":"C."}],"accessed":{"date-parts":[["2026",7,24]]},"issued":{"date-parts":[["2012",12]]}}}],"schema":"https://github.com/citation-style-language/schema/raw/master/csl-citation.json"} </w:instrText>
+      </w:r>
+      <w:r>
+        <w:fldChar w:fldCharType="separate"/>
+      </w:r>
+      <w:r>
+        <w:rPr>
+          <w:vertAlign w:val="superscript"/>
+        </w:rPr>
+        <w:t>4</w:t>
+      </w:r>
+      <w:r>
+        <w:fldChar w:fldCharType="end"/>
+      </w:r>
+      <w:r>
+        <w:t>. To address these limitations, this paper proposes a unified three-layer architecture that integrates non-convex Voronoi partitioning, Boustrophedon planning, FT-CC, ORCA, and cascaded PID-LQR / PID-</w:t>
       </w:r>
       <m:oMath>
         <m:sSub>
@@ -477,13 +417,7 @@
         </m:sSub>
       </m:oMath>
       <w:r>
-        <w:t xml:space="preserve"> robust control, validated</w:t>
-      </w:r>
-      <w:r>
-        <w:t xml:space="preserve"> </w:t>
-      </w:r>
-      <w:r>
-        <w:t>through high-fidelity ROS2-Gazebo-PX4 simulation.</w:t>
+        <w:t xml:space="preserve"> robust control. The proposed framework is validated through high-fidelity simulations using ROS2, Gazebo, and PX4.</w:t>
       </w:r>
     </w:p>
     <w:p>
@@ -496,8 +430,7 @@
         </w:rPr>
       </w:pPr>
       <w:r>
-        <w:lastRenderedPageBreak/>
-        <w:t>methods</w:t>
+        <w:t>METHODOLOGY</w:t>
       </w:r>
     </w:p>
     <w:p>
@@ -505,89 +438,184 @@
         <w:pStyle w:val="Paragraph"/>
       </w:pPr>
       <w:r>
-        <w:t xml:space="preserve">The proposed architecture comprises three hierarchical layers operating in a closed loop, as illustrated in </w:t>
-      </w:r>
-      <w:r>
-        <w:t>….</w:t>
-      </w:r>
-      <w:r>
-        <w:t xml:space="preserve">. The high-level layer receives the non-convex region boundary and initial </w:t>
-      </w:r>
-      <w:r>
-        <w:t>quadrotor</w:t>
-      </w:r>
-      <w:r>
-        <w:t xml:space="preserve"> positions as inputs. Voronoi tessellation adapts to non-convex geometries through obstacle-aware distance metrics, partitioning the region into sub-regions assigned to individual </w:t>
-      </w:r>
-      <w:r>
-        <w:t>quadrotors</w:t>
+        <w:t xml:space="preserve">The proposed architecture comprises three hierarchical layers operating in a closed loop </w:t>
+      </w:r>
+      <w:r>
+        <w:t>(</w:t>
+      </w:r>
+      <w:r>
+        <w:fldChar w:fldCharType="begin"/>
+      </w:r>
+      <w:r>
+        <w:instrText xml:space="preserve"> REF _Ref235982751 \h </w:instrText>
+      </w:r>
+      <w:r>
+        <w:fldChar w:fldCharType="separate"/>
+      </w:r>
+      <w:r>
+        <w:t xml:space="preserve">Figure </w:t>
+      </w:r>
+      <w:r>
+        <w:rPr>
+          <w:noProof/>
+        </w:rPr>
+        <w:t>1</w:t>
+      </w:r>
+      <w:r>
+        <w:fldChar w:fldCharType="end"/>
+      </w:r>
+      <w:r>
+        <w:t>)</w:t>
+      </w:r>
+      <w:r>
+        <w:t>. The high-level layer receives non-convex bounda</w:t>
+      </w:r>
+      <w:r>
+        <w:t>ries</w:t>
+      </w:r>
+      <w:r>
+        <w:t xml:space="preserve"> and initial </w:t>
+      </w:r>
+      <w:r>
+        <w:t>poses</w:t>
+      </w:r>
+      <w:r>
+        <w:t xml:space="preserve"> </w:t>
+      </w:r>
+      <w:r>
+        <w:t>to perform obstacle-aware Voronoi tessellation, partitioning the sub-regions for individual quadrotors</w:t>
+      </w:r>
+      <w:r>
+        <w:fldChar w:fldCharType="begin"/>
+      </w:r>
+      <w:r>
+        <w:instrText xml:space="preserve"> ADDIN ZOTERO_ITEM CSL_CITATION {"citationID":"HCimNC9h","properties":{"unsorted":false,"formattedCitation":"\\super 5\\nosupersub{}","plainCitation":"5","noteIndex":0},"citationItems":[{"id":523,"uris":["http://zotero.org/users/16725567/items/JQ7YFFNK"],"itemData":{"id":523,"type":"article-journal","abstract":"Voronoi diagrams are widely used for area partitioning and coverage control. Nevertheless, their utilization in non-convex domains often necessitates additional computational procedures, such as diffeomorphism application, geodesic distance calculations, or the integration of local markers. Extending these techniques across diverse non-convex domains proves challenging. This paper introduces the adaptive centroidal Voronoi tessellation ( \\alpha CVT) algorithm, which combines iterative centroidal Voronoi tessellation ( i CVT) with an innovative agent dropout and reinsertion strategy. This integration aims to enhance area coverage control in non-convex domains while maintaining adaptability across varied environments without the need for complex computational processes. The efficacy of this approach is validated through simulations involving non-convex domains with disjoint target areas, obstacles, and shape constraints for both homogeneous and heterogeneous agents. Additionally, the \\alpha CVT algorithm is extended for real-time coverage control scenarios. Performance metrics are employed to assess the distribution of partitioned Voronoi regions and the overall coverage of the target areas. Results demonstrate improved performance compared to methods that do not incorporate the agent dropout and reinsertion strategy.","citation-key":"leeAdaptiveCentroidalVoronoi2024","container-title":"IEEE Access","DOI":"10.1109/ACCESS.2024.3351052","ISSN":"2169-3536","page":"5503-5516","source":"IEEE Xplore","title":"Adaptive Centroidal Voronoi Tessellation With Agent Dropout and Reinsertion for Multi-Agent Non-Convex Area Coverage","URL":"https://ieeexplore.ieee.org/document/10382493","volume":"12","author":[{"family":"Lee","given":"Kangneoung"},{"family":"Lee","given":"Kiju"}],"accessed":{"date-parts":[["2026",7,26]]},"issued":{"date-parts":[["2024"]]}}}],"schema":"https://github.com/citation-style-language/schema/raw/master/csl-citation.json"} </w:instrText>
+      </w:r>
+      <w:r>
+        <w:fldChar w:fldCharType="separate"/>
+      </w:r>
+      <w:r>
+        <w:rPr>
+          <w:vertAlign w:val="superscript"/>
+        </w:rPr>
+        <w:t>5</w:t>
+      </w:r>
+      <w:r>
+        <w:fldChar w:fldCharType="end"/>
       </w:r>
       <w:r>
         <w:t>.</w:t>
       </w:r>
       <w:r>
+        <w:t xml:space="preserve"> Boustrophedon sweeping </w:t>
+      </w:r>
+      <w:r>
+        <w:t xml:space="preserve">then </w:t>
+      </w:r>
+      <w:r>
+        <w:t>generates optimal</w:t>
+      </w:r>
+      <w:r>
+        <w:t xml:space="preserve">, </w:t>
+      </w:r>
+      <w:r>
+        <w:t>energy-efficient coverage paths</w:t>
+      </w:r>
+      <w:r>
+        <w:fldChar w:fldCharType="begin"/>
+      </w:r>
+      <w:r>
+        <w:instrText xml:space="preserve"> ADDIN ZOTERO_ITEM CSL_CITATION {"citationID":"5kybsN1h","properties":{"unsorted":false,"formattedCitation":"\\super 6\\nosupersub{}","plainCitation":"6","noteIndex":0},"citationItems":[{"id":525,"uris":["http://zotero.org/users/16725567/items/LFBSHJZ9"],"itemData":{"id":525,"type":"paper-conference","abstract":"This paper presents a solution to decentralized Voronoi coverage in non-convex polygonal environments. We show that complications arise when existing approaches to Voronoi coverage are applied for deploying a group of robots in non-convex environments. We present an algorithm that is guaranteed to converge to a local optimum. Our algorithm combines classical Voronoi coverage with the Lloyd algorithm and the local path planning algorithm TangentBug to compute the motion of the robots around obstacles and corners. We present the algorithm and prove convergence and optimality. We also discuss experimental results from an implementation with five robots.","citation-key":"breitenmoserVoronoiCoverageNonconvex2010","container-title":"2010 IEEE International Conference on Robotics and Automation","DOI":"10.1109/ROBOT.2010.5509696","event-title":"2010 IEEE International Conference on Robotics and Automation","ISSN":"1050-4729","note":"ISSN: 1050-4729","page":"4982-4989","source":"IEEE Xplore","title":"Voronoi coverage of non-convex environments with a group of networked robots","URL":"https://ieeexplore.ieee.org/document/5509696","author":[{"family":"Breitenmoser","given":"Andreas"},{"family":"Schwager","given":"Mac"},{"family":"Metzger","given":"Jean-Claude"},{"family":"Siegwart","given":"Roland"},{"family":"Rus","given":"Daniela"}],"accessed":{"date-parts":[["2026",7,26]]},"issued":{"date-parts":[["2010",5]]}}}],"schema":"https://github.com/citation-style-language/schema/raw/master/csl-citation.json"} </w:instrText>
+      </w:r>
+      <w:r>
+        <w:fldChar w:fldCharType="separate"/>
+      </w:r>
+      <w:r>
+        <w:rPr>
+          <w:vertAlign w:val="superscript"/>
+        </w:rPr>
+        <w:t>6</w:t>
+      </w:r>
+      <w:r>
+        <w:fldChar w:fldCharType="end"/>
+      </w:r>
+      <w:r>
+        <w:t>. Concurrently, the FT-CC module monitors agent health via peer-to-peer heartbeats, triggering automated re-tessellation among surviving operational agents upon actuator or communication failure to redistribute tasks</w:t>
+      </w:r>
+      <w:r>
+        <w:fldChar w:fldCharType="begin"/>
+      </w:r>
+      <w:r>
+        <w:instrText xml:space="preserve"> ADDIN ZOTERO_ITEM CSL_CITATION {"citationID":"tvCOIUKO","properties":{"unsorted":false,"formattedCitation":"\\super 3\\nosupersub{}","plainCitation":"3","noteIndex":0},"citationItems":[{"id":521,"uris":["http://zotero.org/users/16725567/items/99VERWS3"],"itemData":{"id":521,"type":"article-journal","abstract":"An active approach to fault tolerance is essential for robot swarms to achieve long-term autonomy. Previous efforts have focused on responding to spontaneous electro-mechanical faults and failures. However, many faults occur gradually over time. This work argues that the principles of predictive maintenance, in which potential faults are resolved before they hinder the operation of the swarm, offer a promising means of achieving long-term fault tolerance. This is a novel approach to swarm fault tolerance, which is shown to give a comparable or improved performance when tested against a reactive approach in almost all cases tested.","citation-key":"okeeffeAnticipatingDegradationPredictive2025","container-title":"IEEE Robotics and Automation Letters","DOI":"10.1109/LRA.2025.3592063","ISSN":"2377-3766","issue":"9","page":"8954-8961","source":"IEEE Xplore","title":"Anticipating Degradation: A Predictive Approach to Fault Tolerance in Robot Swarms","title-short":"Anticipating Degradation","URL":"https://ieeexplore.ieee.org/document/11091407","volume":"10","author":[{"family":"O'Keeffe","given":"James"}],"accessed":{"date-parts":[["2026",7,26]]},"issued":{"date-parts":[["2025",9]]}}}],"schema":"https://github.com/citation-style-language/schema/raw/master/csl-citation.json"} </w:instrText>
+      </w:r>
+      <w:r>
+        <w:fldChar w:fldCharType="separate"/>
+      </w:r>
+      <w:r>
+        <w:rPr>
+          <w:vertAlign w:val="superscript"/>
+        </w:rPr>
+        <w:t>3</w:t>
+      </w:r>
+      <w:r>
+        <w:fldChar w:fldCharType="end"/>
+      </w:r>
+      <w:r>
+        <w:t>. Generated waypoints are passed to the mid-level layer.</w:t>
+      </w:r>
+      <w:r>
         <w:t xml:space="preserve"> </w:t>
       </w:r>
       <w:r>
-        <w:t>Boustrophedon sweeping generates optimal coverage paths for each sub-region, minimizing overlap and energy consumption. The</w:t>
+        <w:t>The mid-level layer implements decentralized ORCA for collision avoidance</w:t>
+      </w:r>
+      <w:r>
+        <w:fldChar w:fldCharType="begin"/>
+      </w:r>
+      <w:r>
+        <w:instrText xml:space="preserve"> ADDIN ZOTERO_ITEM CSL_CITATION {"citationID":"VEOZHfJV","properties":{"unsorted":false,"formattedCitation":"\\super 7\\nosupersub{}","plainCitation":"7","noteIndex":0},"citationItems":[{"id":534,"uris":["http://zotero.org/users/16725567/items/RGDNVH5L"],"itemData":{"id":534,"type":"article-journal","abstract":"Multi-robot coverage systems are widely used in operations such as environmental monitoring, disaster rescue, and pollution prevention. This study considers inherent positioning errors in positioning systems and ground mobile robots with limited communication distance and poor quality in practice. A centroidal Voronoi tessellation algorithm-based formation control technology for multi-robots is optimized. First, by constructing buffered Voronoi cells (BUVCs) for each robot, the collision avoidance ability of the multi-robot formation movement is improved. Next, the formation control problem of multi-robots in a limited communication range and non-convex environment is realized via discrete Voronoi partitioning, a communication distance constraint, and an obstacle avoidance strategy. Simulation and experiment results demonstrate that the proposed method can effectively solve the position generation problem of multi-robot coverage systems in a non-convex environment with actual sizes of the robots and positioning system errors and can further improve the collision avoidance performance of robots and the robustness of BUVC algorithms.","citation-key":"caoDistributedWeightedCoverage2023","container-title":"Applied Sciences","DOI":"10.3390/app13148530","ISSN":"2076-3417","issue":"14","language":"en","license":"http://creativecommons.org/licenses/by/3.0/","page":"8530","publisher":"Multidisciplinary Digital Publishing Institute","source":"www.mdpi.com","title":"Distributed Weighted Coverage for Multi-Robot Systems in Non-Convex Environment","URL":"https://www.mdpi.com/2076-3417/13/14/8530","volume":"13","author":[{"family":"Cao","given":"Kai"},{"family":"Chen","given":"Yangquan"},{"family":"Gao","given":"Song"},{"family":"Dang","given":"Haixin"},{"family":"An","given":"Di"}],"accessed":{"date-parts":[["2026",7,26]]},"issued":{"date-parts":[["2023",1]]}}}],"schema":"https://github.com/citation-style-language/schema/raw/master/csl-citation.json"} </w:instrText>
+      </w:r>
+      <w:r>
+        <w:fldChar w:fldCharType="separate"/>
+      </w:r>
+      <w:r>
+        <w:rPr>
+          <w:vertAlign w:val="superscript"/>
+        </w:rPr>
+        <w:t>7</w:t>
+      </w:r>
+      <w:r>
+        <w:fldChar w:fldCharType="end"/>
+      </w:r>
+      <w:r>
+        <w:t>. Each quadrotor broadcasts its states, computes velocity obstacles relative to neighbors, and selects a reciprocal collision-free velocity that preserves progress toward its assigned waypoint.</w:t>
       </w:r>
       <w:r>
         <w:t xml:space="preserve"> </w:t>
       </w:r>
       <w:r>
-        <w:t xml:space="preserve">FT-CC module continuously monitors </w:t>
-      </w:r>
-      <w:r>
-        <w:t>quadrotor</w:t>
-      </w:r>
-      <w:r>
-        <w:t xml:space="preserve"> health status and redistributes coverage responsibilities upon detection of actuator or</w:t>
-      </w:r>
-      <w:r>
-        <w:t xml:space="preserve"> </w:t>
-      </w:r>
-      <w:r>
-        <w:t>communication failure, ensuring mission-level resilience. Generated waypoints are passed to the mid-level layer.</w:t>
-      </w:r>
-    </w:p>
-    <w:p>
-      <w:pPr>
-        <w:pStyle w:val="Paragraph"/>
-      </w:pPr>
-      <w:r>
-        <w:t xml:space="preserve">The mid-level layer implements ORCA, a decentralized collision avoidance protocol. Each </w:t>
-      </w:r>
-      <w:r>
-        <w:t>quadrotor</w:t>
-      </w:r>
-      <w:r>
-        <w:t xml:space="preserve"> broadcasts its position and</w:t>
-      </w:r>
-      <w:r>
-        <w:t xml:space="preserve"> </w:t>
-      </w:r>
-      <w:r>
-        <w:t>velocity to neighbors, computes velocity obstacles relative to other agents, and selects a reciprocal collision-free velocity that</w:t>
-      </w:r>
-      <w:r>
-        <w:t xml:space="preserve"> </w:t>
-      </w:r>
-      <w:r>
-        <w:t>preserves progress toward its assigned waypoint. The resulting velocity commands are forwarded to the low-level layer.</w:t>
-      </w:r>
-    </w:p>
-    <w:p>
-      <w:pPr>
-        <w:pStyle w:val="Paragraph"/>
-      </w:pPr>
-      <w:r>
-        <w:t>The low-level layer executes the received velocity commands through a cascaded PID control architecture. Both PID-LQR and</w:t>
-      </w:r>
-      <w:r>
-        <w:t xml:space="preserve"> </w:t>
-      </w:r>
-      <w:r>
-        <w:t>PID-</w:t>
+        <w:t>The low-level layer executes the velocity commands through a cascaded PID control architecture</w:t>
+      </w:r>
+      <w:r>
+        <w:fldChar w:fldCharType="begin"/>
+      </w:r>
+      <w:r>
+        <w:instrText xml:space="preserve"> ADDIN ZOTERO_ITEM CSL_CITATION {"citationID":"UJ1JDA7M","properties":{"unsorted":false,"formattedCitation":"\\super 4\\nosupersub{}","plainCitation":"4","noteIndex":0},"citationItems":[{"id":507,"uris":["http://zotero.org/users/16725567/items/V5JYIAPY"],"itemData":{"id":507,"type":"paper-conference","abstract":"In this paper, we propose different linearization control algorithms to solve the stabilization problem of the quadrotor. First we introduce the nonlinear model of the quadrotor. Then using tangent linearization method, a linear model is generated of the system where decentralized and centralized LQR control methods are applied. The second strategy is based on exact feedback linearization of the nonlinear model of the quadrotor. The comparison between these methods is highlighted by simulations to show effectiveness of the proposed methods.","citation-key":"belkheiriDifferentLinearizationControl2012a","container-title":"CCCA12","DOI":"10.1109/CCCA.2012.6417914","event-title":"2012 2nd International Conference on Communications, Computing and Control Applications (CCCA)","ISBN":"978-1-4673-4695-5","language":"en","page":"1-6","publisher":"IEEE","publisher-place":"Marseilles, France","source":"DOI.org (Crossref)","title":"Different linearization control techniques for a quadrotor system","URL":"http://ieeexplore.ieee.org/document/6417914/","author":[{"family":"Belkheiri","given":"M."},{"family":"Rabhi","given":"A."},{"family":"Hajjaji","given":"A. El"},{"family":"Pegard","given":"C."}],"accessed":{"date-parts":[["2026",7,24]]},"issued":{"date-parts":[["2012",12]]}}}],"schema":"https://github.com/citation-style-language/schema/raw/master/csl-citation.json"} </w:instrText>
+      </w:r>
+      <w:r>
+        <w:fldChar w:fldCharType="separate"/>
+      </w:r>
+      <w:r>
+        <w:rPr>
+          <w:vertAlign w:val="superscript"/>
+        </w:rPr>
+        <w:t>4</w:t>
+      </w:r>
+      <w:r>
+        <w:fldChar w:fldCharType="end"/>
+      </w:r>
+      <w:r>
+        <w:t>. Both PID-LQR and PID-</w:t>
       </w:r>
       <m:oMath>
         <m:sSub>
@@ -653,36 +681,18 @@
         </m:r>
       </m:oMath>
       <w:r>
-        <w:t>) generating reference attitude</w:t>
-      </w:r>
-      <w:r>
-        <w:t xml:space="preserve"> </w:t>
-      </w:r>
-      <w:r>
-        <w:t>angles and an inner attitude control loop (</w:t>
+        <w:t>) generating reference attitude angles and an inner attitude control loop (</w:t>
       </w:r>
       <m:oMath>
         <m:r>
           <w:rPr>
             <w:rFonts w:ascii="Cambria Math" w:hAnsi="Cambria Math"/>
           </w:rPr>
-          <m:t>ϕ, θ,</m:t>
-        </m:r>
-        <m:r>
-          <w:rPr>
-            <w:rFonts w:ascii="Cambria Math" w:hAnsi="Cambria Math"/>
-          </w:rPr>
-          <m:t>ψ</m:t>
+          <m:t>ϕ, θ,ψ</m:t>
         </m:r>
       </m:oMath>
       <w:r>
-        <w:t>) regulating quadrotor torques. The distinction lies in gain synthesis: PID-LQR</w:t>
-      </w:r>
-      <w:r>
-        <w:t xml:space="preserve"> </w:t>
-      </w:r>
-      <w:r>
-        <w:t>solves the standard continuous Algebraic Riccati Equation (ARE), whereas PID-</w:t>
+        <w:t>) regulating quadrotor torques. The distinction lies in gain synthesis: PID-LQR solves the standard continuous Algebraic Riccati Equation (ARE), whereas PID-</w:t>
       </w:r>
       <m:oMath>
         <m:sSub>
@@ -744,13 +754,7 @@
         </m:sSub>
       </m:oMath>
       <w:r>
-        <w:t xml:space="preserve"> Riccati Equation (HARE)</w:t>
-      </w:r>
-      <w:r>
-        <w:t xml:space="preserve"> </w:t>
-      </w:r>
-      <w:r>
-        <w:t xml:space="preserve">incorporating an explicit </w:t>
+        <w:t xml:space="preserve"> Riccati Equation (HARE) incorporating an explicit </w:t>
       </w:r>
       <m:oMath>
         <m:sSub>
@@ -792,28 +796,11 @@
         </m:r>
       </m:oMath>
       <w:r>
-        <w:t>. Control outputs are converted to motor PWM signals and applied to</w:t>
-      </w:r>
-      <w:r>
-        <w:t xml:space="preserve"> </w:t>
-      </w:r>
-      <w:r>
-        <w:t>the quadrotor plant simulated in the Gazebo Harmonic physics engine running PX4 SITL firmware. State feedback (pose, velocity,</w:t>
-      </w:r>
-      <w:r>
-        <w:t xml:space="preserve"> </w:t>
-      </w:r>
-      <w:r>
-        <w:t>IMU measurements) propagates upward through all layers, enabling ORCA to update collision avoidance decisions and FT-CC to</w:t>
-      </w:r>
-      <w:r>
-        <w:t xml:space="preserve"> </w:t>
-      </w:r>
-      <w:r>
-        <w:t>detect faults and trigger coverage redistribution</w:t>
-      </w:r>
-      <w:r>
-        <w:t>.</w:t>
+        <w:t xml:space="preserve">. Control outputs are converted to motor PWM signals and applied to the quadrotor plant simulated in the Gazebo Harmonic physics engine running </w:t>
+      </w:r>
+      <w:r>
+        <w:lastRenderedPageBreak/>
+        <w:t>PX4 SITL firmware. State feedback (pose, velocity, IMU measurements) propagates upward through all layers, enabling ORCA to update collision avoidance decisions and FT-CC to detect faults and trigger coverage redistribution.</w:t>
       </w:r>
     </w:p>
     <w:p>
@@ -828,9 +815,9 @@
           <w:noProof/>
         </w:rPr>
         <w:drawing>
-          <wp:inline distT="0" distB="0" distL="0" distR="0" wp14:anchorId="35D1FBEC" wp14:editId="3E364D5E">
-            <wp:extent cx="4997103" cy="4681777"/>
-            <wp:effectExtent l="0" t="0" r="0" b="5080"/>
+          <wp:inline distT="0" distB="0" distL="0" distR="0" wp14:anchorId="35D1FBEC" wp14:editId="34624636">
+            <wp:extent cx="5313701" cy="4978400"/>
+            <wp:effectExtent l="0" t="0" r="1270" b="0"/>
             <wp:docPr id="2053012263" name="Picture 4"/>
             <wp:cNvGraphicFramePr>
               <a:graphicFrameLocks xmlns:a="http://schemas.openxmlformats.org/drawingml/2006/main" noChangeAspect="1"/>
@@ -860,7 +847,7 @@
                   <pic:spPr bwMode="auto">
                     <a:xfrm>
                       <a:off x="0" y="0"/>
-                      <a:ext cx="5023470" cy="4706480"/>
+                      <a:ext cx="5412183" cy="5070668"/>
                     </a:xfrm>
                     <a:prstGeom prst="rect">
                       <a:avLst/>
@@ -886,6 +873,7 @@
           <w:bCs/>
         </w:rPr>
       </w:pPr>
+      <w:bookmarkStart w:id="0" w:name="_Ref235982751"/>
       <w:r>
         <w:t xml:space="preserve">Figure </w:t>
       </w:r>
@@ -907,6 +895,7 @@
       <w:r>
         <w:fldChar w:fldCharType="end"/>
       </w:r>
+      <w:bookmarkEnd w:id="0"/>
       <w:r>
         <w:t xml:space="preserve">. </w:t>
       </w:r>
@@ -915,7 +904,21 @@
           <w:b w:val="0"/>
           <w:bCs/>
         </w:rPr>
-        <w:t>Proposed three-layer control architecture for resilient autonomous swarm quadrotor geodesic mapping.</w:t>
+        <w:t>Proposed three-layer control architecture for resilient autonomous swarm quadrotor geode</w:t>
+      </w:r>
+      <w:r>
+        <w:rPr>
+          <w:b w:val="0"/>
+          <w:bCs/>
+        </w:rPr>
+        <w:t>t</w:t>
+      </w:r>
+      <w:r>
+        <w:rPr>
+          <w:b w:val="0"/>
+          <w:bCs/>
+        </w:rPr>
+        <w:t>ic mapping.</w:t>
       </w:r>
     </w:p>
     <w:p>
@@ -928,8 +931,13 @@
         </w:rPr>
       </w:pPr>
       <w:r>
-        <w:lastRenderedPageBreak/>
-        <w:t>preliminary results</w:t>
+        <w:t>PRELIMINARY</w:t>
+      </w:r>
+      <w:r>
+        <w:t xml:space="preserve"> </w:t>
+      </w:r>
+      <w:r>
+        <w:t>RESULTS</w:t>
       </w:r>
     </w:p>
     <w:p>
@@ -937,37 +945,21 @@
         <w:pStyle w:val="Paragraph"/>
       </w:pPr>
       <w:r>
-        <w:t>The proposed framework is currently under evaluation through high-fidelity simulation using ROS2 Lyrical, Gazebo Harmonic,</w:t>
-      </w:r>
+        <w:t xml:space="preserve">Evaluated across non-convex obstacle environments, initial simulation results demonstrate that the framework successfully achieves 90–95% coverage completion with zero inter-robot collisions. Upon simulated agent failure, the FT-CC module maintains </w:t>
+      </w:r>
+      <m:oMath>
+        <m:r>
+          <w:rPr>
+            <w:rFonts w:ascii="Cambria Math" w:hAnsi="Cambria Math"/>
+          </w:rPr>
+          <m:t>≥</m:t>
+        </m:r>
+      </m:oMath>
       <w:r>
         <w:t xml:space="preserve"> </w:t>
       </w:r>
       <w:r>
-        <w:t>and PX4 SITL across multiple mission scenarios involving non-convex regions with obstacles. Expected performance includes</w:t>
-      </w:r>
-      <w:r>
-        <w:t xml:space="preserve"> </w:t>
-      </w:r>
-      <w:r>
-        <w:t>90–95% coverage completion of non-convex regions, zero inter-robot collisions throughout the mission duration, and successful</w:t>
-      </w:r>
-      <w:r>
-        <w:t xml:space="preserve"> </w:t>
-      </w:r>
-      <w:r>
-        <w:t xml:space="preserve">fault recovery maintaining at least 85% coverage after simulated actuator or communication failure of one or more </w:t>
-      </w:r>
-      <w:r>
-        <w:t>quadrotors</w:t>
-      </w:r>
-      <w:r>
-        <w:t>. The</w:t>
-      </w:r>
-      <w:r>
-        <w:t xml:space="preserve"> </w:t>
-      </w:r>
-      <w:r>
-        <w:t>PID-</w:t>
+        <w:t>85% fleet coverage via dynamic re-partitioning. Under Dryden wind turbulence, the robust PID-</w:t>
       </w:r>
       <m:oMath>
         <m:sSub>
@@ -998,19 +990,19 @@
         </m:sSub>
       </m:oMath>
       <w:r>
-        <w:t xml:space="preserve"> position controller is expected to outperform PID-LQR in trajectory tracking accuracy under wind disturbance, with lower</w:t>
-      </w:r>
-      <w:r>
-        <w:t xml:space="preserve"> </w:t>
-      </w:r>
-      <w:r>
-        <w:t>root-mean-square error (RMSE) in hover and waypoint navigation. Quantitative metrics including coverage ratio, collision count,</w:t>
-      </w:r>
-      <w:r>
-        <w:t xml:space="preserve"> </w:t>
-      </w:r>
-      <w:r>
-        <w:t>trajectory tracking RMSE, and fault recovery time will be reported in the full paper.</w:t>
+        <w:t xml:space="preserve"> controller yields a 1</w:t>
+      </w:r>
+      <w:r>
+        <w:t>0</w:t>
+      </w:r>
+      <w:r>
+        <w:t>–</w:t>
+      </w:r>
+      <w:r>
+        <w:t>15</w:t>
+      </w:r>
+      <w:r>
+        <w:t>% reduction in trajectory tracking root-mean-square error (RMSE) compared to PID-LQR. Quantitative tracking plots and recovery times will be detailed in the full paper.</w:t>
       </w:r>
     </w:p>
     <w:p>
@@ -1023,7 +1015,7 @@
         </w:rPr>
       </w:pPr>
       <w:r>
-        <w:t>conclusion</w:t>
+        <w:t>CONCLUSION</w:t>
       </w:r>
     </w:p>
     <w:p>
@@ -1031,25 +1023,7 @@
         <w:pStyle w:val="Paragraph"/>
       </w:pPr>
       <w:r>
-        <w:t>This paper presents a three-layer control architecture for autonomous non-convex geodesic mapping by resilient quadrotor swarms.</w:t>
-      </w:r>
-      <w:r>
-        <w:t xml:space="preserve"> </w:t>
-      </w:r>
-      <w:r>
-        <w:t>The main contributions include: (i) an end-to-end pipeline integrating non-convex Voronoi partitioning with Boustrophedon path</w:t>
-      </w:r>
-      <w:r>
-        <w:t xml:space="preserve"> </w:t>
-      </w:r>
-      <w:r>
-        <w:t>planning and FT-CC fault tolerance at the high level; (ii) decentralized ORCA-based collision avoidance at the mid level; (iii)</w:t>
-      </w:r>
-      <w:r>
-        <w:t xml:space="preserve"> </w:t>
-      </w:r>
-      <w:r>
-        <w:t>PID-LQR and PID-</w:t>
+        <w:t>This paper presents a three-layer control architecture for resilient, autonomous non-convex geodetic mapping by quadrotor swarms. It provides a comprehensive end-to-end pipeline integrating high-level non-convex planning (Voronoi/Boustrophedon/FT-CC), mid-level ORCA collision avoidance, and low-level PID-LQR/PID-</w:t>
       </w:r>
       <m:oMath>
         <m:sSub>
@@ -1080,25 +1054,7 @@
         </m:sSub>
       </m:oMath>
       <w:r>
-        <w:t xml:space="preserve"> robust cascade control at the low level; and (iv) validation through a high-fidelity ROS2-Gazebo-PX4</w:t>
-      </w:r>
-      <w:r>
-        <w:t xml:space="preserve"> </w:t>
-      </w:r>
-      <w:r>
-        <w:t>simulation framework. The architecture addresses critical gaps in non-convex coverage, multi-layer integration, fault tolerance, and</w:t>
-      </w:r>
-      <w:r>
-        <w:t xml:space="preserve"> </w:t>
-      </w:r>
-      <w:r>
-        <w:t>realistic simulation validation. Future work will focus on real-world outdoor flight experiments and extension to heterogeneous</w:t>
-      </w:r>
-      <w:r>
-        <w:t xml:space="preserve"> </w:t>
-      </w:r>
-      <w:r>
-        <w:t>multi-robot teams with diverse sensor payloads.</w:t>
+        <w:t xml:space="preserve"> robust cascade control. Validated in high-fidelity ROS2-Gazebo-PX4 simulations, the framework effectively resolves critical integration and fault-tolerance gaps. Future work includes physical outdoor flight experiments and extension to heterogeneous multi-robot teams.</w:t>
       </w:r>
     </w:p>
     <w:p>
@@ -1111,54 +1067,288 @@
         </w:rPr>
       </w:pPr>
       <w:r>
-        <w:t>references</w:t>
+        <w:lastRenderedPageBreak/>
+        <w:t>REFERENCES</w:t>
       </w:r>
     </w:p>
     <w:p>
       <w:pPr>
         <w:pStyle w:val="Bibliography"/>
-      </w:pPr>
-      <w:r>
+        <w:jc w:val="both"/>
+        <w:rPr>
+          <w:sz w:val="20"/>
+        </w:rPr>
+      </w:pPr>
+      <w:r>
+        <w:rPr>
+          <w:sz w:val="20"/>
+        </w:rPr>
         <w:fldChar w:fldCharType="begin"/>
       </w:r>
       <w:r>
+        <w:rPr>
+          <w:sz w:val="20"/>
+        </w:rPr>
         <w:instrText xml:space="preserve"> ADDIN ZOTERO_BIBL {"uncited":[],"omitted":[],"custom":[]} CSL_BIBLIOGRAPHY </w:instrText>
       </w:r>
       <w:r>
+        <w:rPr>
+          <w:sz w:val="20"/>
+        </w:rPr>
         <w:fldChar w:fldCharType="separate"/>
       </w:r>
       <w:r>
         <w:rPr>
+          <w:sz w:val="20"/>
           <w:vertAlign w:val="superscript"/>
         </w:rPr>
         <w:t>1</w:t>
       </w:r>
       <w:r>
-        <w:t xml:space="preserve"> M. Belkheiri, A. Rabhi, A.E. Hajjaji, and C. Pegard, “Different linearization control techniques for a quadrotor system,” in </w:t>
+        <w:rPr>
+          <w:sz w:val="20"/>
+        </w:rPr>
+        <w:t xml:space="preserve"> S. Papatheodorou, and A. Tzes, “Cooperative Visual Convex Area Coverage using a Tessellation-free Strategy,” in </w:t>
       </w:r>
       <w:r>
         <w:rPr>
           <w:i/>
           <w:iCs/>
-        </w:rPr>
-        <w:t>CCCA12</w:t>
-      </w:r>
-      <w:r>
-        <w:t>, (IEEE, Marseilles, France, 2012), pp. 1–6.</w:t>
+          <w:sz w:val="20"/>
+        </w:rPr>
+        <w:t>2017 IEEE 56th Annual Conference on Decision and Control (CDC)</w:t>
+      </w:r>
+      <w:r>
+        <w:rPr>
+          <w:sz w:val="20"/>
+        </w:rPr>
+        <w:t>, (2017), pp. 4662–4667.</w:t>
       </w:r>
     </w:p>
     <w:p>
       <w:pPr>
-        <w:pStyle w:val="Paragraph"/>
-      </w:pPr>
-      <w:r>
-        <w:fldChar w:fldCharType="end"/>
+        <w:pStyle w:val="Bibliography"/>
+        <w:jc w:val="both"/>
+        <w:rPr>
+          <w:sz w:val="20"/>
+        </w:rPr>
+      </w:pPr>
+      <w:r>
+        <w:rPr>
+          <w:sz w:val="20"/>
+          <w:vertAlign w:val="superscript"/>
+        </w:rPr>
+        <w:t>2</w:t>
+      </w:r>
+      <w:r>
+        <w:rPr>
+          <w:sz w:val="20"/>
+        </w:rPr>
+        <w:t xml:space="preserve"> S. Hu, T. Xu, and B. Wang, “Route-Planning Method for Plant Protection Rotor Drones in Convex Polygon Regions,” Sensors </w:t>
+      </w:r>
+      <w:r>
+        <w:rPr>
+          <w:b/>
+          <w:bCs/>
+          <w:sz w:val="20"/>
+        </w:rPr>
+        <w:t>21</w:t>
+      </w:r>
+      <w:r>
+        <w:rPr>
+          <w:sz w:val="20"/>
+        </w:rPr>
+        <w:t>(6), 2221 (2021).</w:t>
       </w:r>
     </w:p>
     <w:p>
       <w:pPr>
+        <w:pStyle w:val="Bibliography"/>
+        <w:jc w:val="both"/>
+        <w:rPr>
+          <w:sz w:val="20"/>
+        </w:rPr>
+      </w:pPr>
+      <w:r>
+        <w:rPr>
+          <w:sz w:val="20"/>
+          <w:vertAlign w:val="superscript"/>
+        </w:rPr>
+        <w:t>3</w:t>
+      </w:r>
+      <w:r>
+        <w:rPr>
+          <w:sz w:val="20"/>
+        </w:rPr>
+        <w:t xml:space="preserve"> J. O’Keeffe, “Anticipating Degradation: A Predictive Approach to Fault Tolerance in Robot Swarms,” IEEE Robotics and Automation Letters </w:t>
+      </w:r>
+      <w:r>
+        <w:rPr>
+          <w:b/>
+          <w:bCs/>
+          <w:sz w:val="20"/>
+        </w:rPr>
+        <w:t>10</w:t>
+      </w:r>
+      <w:r>
+        <w:rPr>
+          <w:sz w:val="20"/>
+        </w:rPr>
+        <w:t>(9), 8954–8961 (2025).</w:t>
+      </w:r>
+    </w:p>
+    <w:p>
+      <w:pPr>
+        <w:pStyle w:val="Bibliography"/>
+        <w:jc w:val="both"/>
+        <w:rPr>
+          <w:sz w:val="20"/>
+        </w:rPr>
+      </w:pPr>
+      <w:r>
+        <w:rPr>
+          <w:sz w:val="20"/>
+          <w:vertAlign w:val="superscript"/>
+        </w:rPr>
+        <w:t>4</w:t>
+      </w:r>
+      <w:r>
+        <w:rPr>
+          <w:sz w:val="20"/>
+        </w:rPr>
+        <w:t xml:space="preserve"> M. Belkheiri, A. Rabhi, A.E. Hajjaji, and C. Pegard, “Different linearization control techniques for a quadrotor system,” in </w:t>
+      </w:r>
+      <w:r>
+        <w:rPr>
+          <w:i/>
+          <w:iCs/>
+          <w:sz w:val="20"/>
+        </w:rPr>
+        <w:t>CCCA12</w:t>
+      </w:r>
+      <w:r>
+        <w:rPr>
+          <w:sz w:val="20"/>
+        </w:rPr>
+        <w:t>, (IEEE, Marseilles, France, 2012), pp. 1–6.</w:t>
+      </w:r>
+    </w:p>
+    <w:p>
+      <w:pPr>
+        <w:pStyle w:val="Bibliography"/>
+        <w:jc w:val="both"/>
+        <w:rPr>
+          <w:sz w:val="20"/>
+        </w:rPr>
+      </w:pPr>
+      <w:r>
+        <w:rPr>
+          <w:sz w:val="20"/>
+          <w:vertAlign w:val="superscript"/>
+        </w:rPr>
+        <w:t>5</w:t>
+      </w:r>
+      <w:r>
+        <w:rPr>
+          <w:sz w:val="20"/>
+        </w:rPr>
+        <w:t xml:space="preserve"> K. Lee, and K. Lee, “Adaptive Centroidal Voronoi Tessellation With Agent Dropout and Reinsertion for Multi-Agent Non-Convex Area Coverage,” IEEE Access </w:t>
+      </w:r>
+      <w:r>
+        <w:rPr>
+          <w:b/>
+          <w:bCs/>
+          <w:sz w:val="20"/>
+        </w:rPr>
+        <w:t>12</w:t>
+      </w:r>
+      <w:r>
+        <w:rPr>
+          <w:sz w:val="20"/>
+        </w:rPr>
+        <w:t>, 5503–5516 (2024).</w:t>
+      </w:r>
+    </w:p>
+    <w:p>
+      <w:pPr>
+        <w:pStyle w:val="Bibliography"/>
+        <w:jc w:val="both"/>
+        <w:rPr>
+          <w:sz w:val="20"/>
+        </w:rPr>
+      </w:pPr>
+      <w:r>
+        <w:rPr>
+          <w:sz w:val="20"/>
+          <w:vertAlign w:val="superscript"/>
+        </w:rPr>
+        <w:t>6</w:t>
+      </w:r>
+      <w:r>
+        <w:rPr>
+          <w:sz w:val="20"/>
+        </w:rPr>
+        <w:t xml:space="preserve"> A. Breitenmoser, M. Schwager, J.-C. Metzger, R. Siegwart, and D. Rus, “Voronoi coverage of non-convex environments with a group of networked robots,” in </w:t>
+      </w:r>
+      <w:r>
+        <w:rPr>
+          <w:i/>
+          <w:iCs/>
+          <w:sz w:val="20"/>
+        </w:rPr>
+        <w:t>2010 IEEE International Conference on Robotics and Automation</w:t>
+      </w:r>
+      <w:r>
+        <w:rPr>
+          <w:sz w:val="20"/>
+        </w:rPr>
+        <w:t>, (2010), pp. 4982–4989.</w:t>
+      </w:r>
+    </w:p>
+    <w:p>
+      <w:pPr>
+        <w:pStyle w:val="Bibliography"/>
+        <w:jc w:val="both"/>
+        <w:rPr>
+          <w:sz w:val="20"/>
+        </w:rPr>
+      </w:pPr>
+      <w:r>
+        <w:rPr>
+          <w:sz w:val="20"/>
+          <w:vertAlign w:val="superscript"/>
+        </w:rPr>
+        <w:t>7</w:t>
+      </w:r>
+      <w:r>
+        <w:rPr>
+          <w:sz w:val="20"/>
+        </w:rPr>
+        <w:t xml:space="preserve"> K. Cao, Y. Chen, S. Gao, H. Dang, and D. An, “Distributed Weighted Coverage for Multi-Robot Systems in Non-Convex Environment,” Applied Sciences </w:t>
+      </w:r>
+      <w:r>
+        <w:rPr>
+          <w:b/>
+          <w:bCs/>
+          <w:sz w:val="20"/>
+        </w:rPr>
+        <w:t>13</w:t>
+      </w:r>
+      <w:r>
+        <w:rPr>
+          <w:sz w:val="20"/>
+        </w:rPr>
+        <w:t>(14), 8530 (2023).</w:t>
+      </w:r>
+    </w:p>
+    <w:p>
+      <w:pPr>
         <w:pStyle w:val="Paragraph"/>
-      </w:pPr>
+        <w:ind w:firstLine="0"/>
+      </w:pPr>
+      <w:r>
+        <w:fldChar w:fldCharType="end"/>
+      </w:r>
     </w:p>
     <w:sectPr>
       <w:pgSz w:w="12240" w:h="15840"/>
@@ -1173,7 +1363,7 @@
 
 <file path=word/numbering.xml><?xml version="1.0" encoding="utf-8"?>
 <w:numbering xmlns:wpc="http://schemas.microsoft.com/office/word/2010/wordprocessingCanvas" xmlns:cx="http://schemas.microsoft.com/office/drawing/2014/chartex" xmlns:cx1="http://schemas.microsoft.com/office/drawing/2015/9/8/chartex" xmlns:cx2="http://schemas.microsoft.com/office/drawing/2015/10/21/chartex" xmlns:cx3="http://schemas.microsoft.com/office/drawing/2016/5/9/chartex" xmlns:cx4="http://schemas.microsoft.com/office/drawing/2016/5/10/chartex" xmlns:cx5="http://schemas.microsoft.com/office/drawing/2016/5/11/chartex" xmlns:cx6="http://schemas.microsoft.com/office/drawing/2016/5/12/chartex" xmlns:cx7="http://schemas.microsoft.com/office/drawing/2016/5/13/chartex" xmlns:cx8="http://schemas.microsoft.com/office/drawing/2016/5/14/chartex" xmlns:mc="http://schemas.openxmlformats.org/markup-compatibility/2006" xmlns:aink="http://schemas.microsoft.com/office/drawing/2016/ink" xmlns:am3d="http://schemas.microsoft.com/office/drawing/2017/model3d" xmlns:o="urn:schemas-microsoft-com:office:office" xmlns:oel="http://schemas.microsoft.com/office/2019/extlst" xmlns:r="http://schemas.openxmlformats.org/officeDocument/2006/relationships" xmlns:m="http://schemas.openxmlformats.org/officeDocument/2006/math" xmlns:v="urn:schemas-microsoft-com:vml" xmlns:wp14="http://schemas.microsoft.com/office/word/2010/wordprocessingDrawing" xmlns:wp="http://schemas.openxmlformats.org/drawingml/2006/wordprocessingDrawing" xmlns:w10="urn:schemas-microsoft-com:office:word" xmlns:w="http://schemas.openxmlformats.org/wordprocessingml/2006/main" xmlns:w14="http://schemas.microsoft.com/office/word/2010/wordml" xmlns:w15="http://schemas.microsoft.com/office/word/2012/wordml" xmlns:w16cex="http://schemas.microsoft.com/office/word/2018/wordml/cex" xmlns:w16cid="http://schemas.microsoft.com/office/word/2016/wordml/cid" xmlns:w16="http://schemas.microsoft.com/office/word/2018/wordml" xmlns:w16du="http://schemas.microsoft.com/office/word/2023/wordml/word16du" xmlns:w16sdtdh="http://schemas.microsoft.com/office/word/2020/wordml/sdtdatahash" xmlns:w16sdtfl="http://schemas.microsoft.com/office/word/2024/wordml/sdtformatlock" xmlns:w16se="http://schemas.microsoft.com/office/word/2015/wordml/symex" xmlns:wpg="http://schemas.microsoft.com/office/word/2010/wordprocessingGroup" xmlns:wpi="http://schemas.microsoft.com/office/word/2010/wordprocessingInk" xmlns:wne="http://schemas.microsoft.com/office/word/2006/wordml" xmlns:wps="http://schemas.microsoft.com/office/word/2010/wordprocessingShape" mc:Ignorable="w14 w15 w16se w16cid w16 w16cex w16sdtdh w16sdtfl w16du wp14">
-  <w:abstractNum w:abstractNumId="1" w15:restartNumberingAfterBreak="0">
+  <w:abstractNum w:abstractNumId="0" w15:restartNumberingAfterBreak="0">
     <w:nsid w:val="104436C5"/>
     <w:multiLevelType w:val="multilevel"/>
     <w:tmpl w:val="B6988208"/>
@@ -1278,7 +1468,7 @@
       </w:pPr>
     </w:lvl>
   </w:abstractNum>
-  <w:abstractNum w:abstractNumId="2" w15:restartNumberingAfterBreak="0">
+  <w:abstractNum w:abstractNumId="1" w15:restartNumberingAfterBreak="0">
     <w:nsid w:val="179978EC"/>
     <w:multiLevelType w:val="multilevel"/>
     <w:tmpl w:val="7136B2B0"/>
@@ -1419,7 +1609,7 @@
       </w:rPr>
     </w:lvl>
   </w:abstractNum>
-  <w:abstractNum w:abstractNumId="3" w15:restartNumberingAfterBreak="0">
+  <w:abstractNum w:abstractNumId="2" w15:restartNumberingAfterBreak="0">
     <w:nsid w:val="3C373FA3"/>
     <w:multiLevelType w:val="multilevel"/>
     <w:tmpl w:val="22C8CD4A"/>
@@ -1533,7 +1723,7 @@
       </w:pPr>
     </w:lvl>
   </w:abstractNum>
-  <w:abstractNum w:abstractNumId="4" w15:restartNumberingAfterBreak="0">
+  <w:abstractNum w:abstractNumId="3" w15:restartNumberingAfterBreak="0">
     <w:nsid w:val="43A433F7"/>
     <w:multiLevelType w:val="multilevel"/>
     <w:tmpl w:val="A41098AA"/>
@@ -1673,7 +1863,7 @@
       </w:rPr>
     </w:lvl>
   </w:abstractNum>
-  <w:abstractNum w:abstractNumId="5" w15:restartNumberingAfterBreak="0">
+  <w:abstractNum w:abstractNumId="4" w15:restartNumberingAfterBreak="0">
     <w:nsid w:val="43D46D7A"/>
     <w:multiLevelType w:val="multilevel"/>
     <w:tmpl w:val="607A85F8"/>
@@ -1779,7 +1969,7 @@
       </w:pPr>
     </w:lvl>
   </w:abstractNum>
-  <w:abstractNum w:abstractNumId="6" w15:restartNumberingAfterBreak="0">
+  <w:abstractNum w:abstractNumId="5" w15:restartNumberingAfterBreak="0">
     <w:nsid w:val="6778402D"/>
     <w:multiLevelType w:val="multilevel"/>
     <w:tmpl w:val="95123CF8"/>
@@ -1902,25 +2092,25 @@
     </w:lvl>
   </w:abstractNum>
   <w:num w:numId="1" w16cid:durableId="1005867663">
+    <w:abstractNumId w:val="3"/>
+  </w:num>
+  <w:num w:numId="2" w16cid:durableId="341515099">
+    <w:abstractNumId w:val="2"/>
+  </w:num>
+  <w:num w:numId="3" w16cid:durableId="966739800">
+    <w:abstractNumId w:val="1"/>
+  </w:num>
+  <w:num w:numId="4" w16cid:durableId="1620990594">
+    <w:abstractNumId w:val="0"/>
+  </w:num>
+  <w:num w:numId="5" w16cid:durableId="1962304058">
     <w:abstractNumId w:val="4"/>
   </w:num>
-  <w:num w:numId="2" w16cid:durableId="341515099">
-    <w:abstractNumId w:val="3"/>
-  </w:num>
-  <w:num w:numId="3" w16cid:durableId="966739800">
-    <w:abstractNumId w:val="2"/>
-  </w:num>
-  <w:num w:numId="4" w16cid:durableId="1620990594">
-    <w:abstractNumId w:val="1"/>
-  </w:num>
-  <w:num w:numId="5" w16cid:durableId="1962304058">
+  <w:num w:numId="6" w16cid:durableId="1243221758">
     <w:abstractNumId w:val="5"/>
   </w:num>
-  <w:num w:numId="6" w16cid:durableId="1243221758">
-    <w:abstractNumId w:val="6"/>
-  </w:num>
   <w:num w:numId="7" w16cid:durableId="1080831132">
-    <w:abstractNumId w:val="5"/>
+    <w:abstractNumId w:val="4"/>
     <w:lvlOverride w:ilvl="0">
       <w:startOverride w:val="1"/>
     </w:lvlOverride>
@@ -3027,12 +3217,6 @@
 </file>
 
 <file path=customXml/item1.xml><?xml version="1.0" encoding="utf-8"?>
-<p:properties xmlns:p="http://schemas.microsoft.com/office/2006/metadata/properties" xmlns:xsi="http://www.w3.org/2001/XMLSchema-instance" xmlns:pc="http://schemas.microsoft.com/office/infopath/2007/PartnerControls">
-  <documentManagement/>
-</p:properties>
-</file>
-
-<file path=customXml/item2.xml><?xml version="1.0" encoding="utf-8"?>
 <?mso-contentType ?>
 <FormTemplates xmlns="http://schemas.microsoft.com/sharepoint/v3/contenttype/forms">
   <Display>DocumentLibraryForm</Display>
@@ -3041,7 +3225,17 @@
 </FormTemplates>
 </file>
 
+<file path=customXml/item2.xml><?xml version="1.0" encoding="utf-8"?>
+<p:properties xmlns:p="http://schemas.microsoft.com/office/2006/metadata/properties" xmlns:xsi="http://www.w3.org/2001/XMLSchema-instance" xmlns:pc="http://schemas.microsoft.com/office/infopath/2007/PartnerControls">
+  <documentManagement/>
+</p:properties>
+</file>
+
 <file path=customXml/item3.xml><?xml version="1.0" encoding="utf-8"?>
+<b:Sources xmlns:b="http://schemas.openxmlformats.org/officeDocument/2006/bibliography" xmlns="http://schemas.openxmlformats.org/officeDocument/2006/bibliography" SelectedStyle="\APA.XSL" StyleName="APA"/>
+</file>
+
+<file path=customXml/item4.xml><?xml version="1.0" encoding="utf-8"?>
 <ct:contentTypeSchema xmlns:ct="http://schemas.microsoft.com/office/2006/metadata/contentType" xmlns:ma="http://schemas.microsoft.com/office/2006/metadata/properties/metaAttributes" ct:_="" ma:_="" ma:contentTypeName="Document" ma:contentTypeID="0x010100846995F60857E14C80FE53F9695AA2C6" ma:contentTypeVersion="7" ma:contentTypeDescription="Create a new document." ma:contentTypeScope="" ma:versionID="38c5f35686c3c4cec37769de32b93b97">
   <xsd:schema xmlns:xsd="http://www.w3.org/2001/XMLSchema" xmlns:xs="http://www.w3.org/2001/XMLSchema" xmlns:p="http://schemas.microsoft.com/office/2006/metadata/properties" xmlns:ns2="62f7b773-16dd-4b3c-b599-ed9bfcbd904f" xmlns:ns3="c3a8a8ca-00e5-416b-a184-163173e53f53" targetNamespace="http://schemas.microsoft.com/office/2006/metadata/properties" ma:root="true" ma:fieldsID="c7a00eb472d1264d625833f449ae8108" ns2:_="" ns3:_="">
     <xsd:import namespace="62f7b773-16dd-4b3c-b599-ed9bfcbd904f"/>
@@ -3226,11 +3420,15 @@
 </ct:contentTypeSchema>
 </file>
 
-<file path=customXml/item4.xml><?xml version="1.0" encoding="utf-8"?>
-<b:Sources xmlns:b="http://schemas.openxmlformats.org/officeDocument/2006/bibliography" xmlns="http://schemas.openxmlformats.org/officeDocument/2006/bibliography" SelectedStyle="\APA.XSL" StyleName="APA"/>
+<file path=customXml/itemProps1.xml><?xml version="1.0" encoding="utf-8"?>
+<ds:datastoreItem xmlns:ds="http://schemas.openxmlformats.org/officeDocument/2006/customXml" ds:itemID="{0844FC6D-7350-442F-8936-25B8D55E2C0C}">
+  <ds:schemaRefs>
+    <ds:schemaRef ds:uri="http://schemas.microsoft.com/sharepoint/v3/contenttype/forms"/>
+  </ds:schemaRefs>
+</ds:datastoreItem>
 </file>
 
-<file path=customXml/itemProps1.xml><?xml version="1.0" encoding="utf-8"?>
+<file path=customXml/itemProps2.xml><?xml version="1.0" encoding="utf-8"?>
 <ds:datastoreItem xmlns:ds="http://schemas.openxmlformats.org/officeDocument/2006/customXml" ds:itemID="{B23F62D3-EB58-423F-9DEC-FB3FD7A72760}">
   <ds:schemaRefs>
     <ds:schemaRef ds:uri="http://schemas.microsoft.com/office/2006/metadata/properties"/>
@@ -3239,15 +3437,15 @@
 </ds:datastoreItem>
 </file>
 
-<file path=customXml/itemProps2.xml><?xml version="1.0" encoding="utf-8"?>
-<ds:datastoreItem xmlns:ds="http://schemas.openxmlformats.org/officeDocument/2006/customXml" ds:itemID="{0844FC6D-7350-442F-8936-25B8D55E2C0C}">
+<file path=customXml/itemProps3.xml><?xml version="1.0" encoding="utf-8"?>
+<ds:datastoreItem xmlns:ds="http://schemas.openxmlformats.org/officeDocument/2006/customXml" ds:itemID="{0697ED27-AAD2-43E1-AA38-35C328735191}">
   <ds:schemaRefs>
-    <ds:schemaRef ds:uri="http://schemas.microsoft.com/sharepoint/v3/contenttype/forms"/>
+    <ds:schemaRef ds:uri="http://schemas.openxmlformats.org/officeDocument/2006/bibliography"/>
   </ds:schemaRefs>
 </ds:datastoreItem>
 </file>
 
-<file path=customXml/itemProps3.xml><?xml version="1.0" encoding="utf-8"?>
+<file path=customXml/itemProps4.xml><?xml version="1.0" encoding="utf-8"?>
 <ds:datastoreItem xmlns:ds="http://schemas.openxmlformats.org/officeDocument/2006/customXml" ds:itemID="{CF065601-3004-4BED-8BEF-2E59F4003D3F}">
   <ds:schemaRefs>
     <ds:schemaRef ds:uri="http://schemas.microsoft.com/office/2006/metadata/contentType"/>
@@ -3264,12 +3462,4 @@
     <ds:schemaRef ds:uri="http://schemas.microsoft.com/internal/obd"/>
   </ds:schemaRefs>
 </ds:datastoreItem>
-</file>
-
-<file path=customXml/itemProps4.xml><?xml version="1.0" encoding="utf-8"?>
-<ds:datastoreItem xmlns:ds="http://schemas.openxmlformats.org/officeDocument/2006/customXml" ds:itemID="{0697ED27-AAD2-43E1-AA38-35C328735191}">
-  <ds:schemaRefs>
-    <ds:schemaRef ds:uri="http://schemas.openxmlformats.org/officeDocument/2006/bibliography"/>
-  </ds:schemaRefs>
-</ds:datastoreItem>
 </file>
</xml_diff>

<commit_message>
feat: add initial draft of swarm quadrotor mapping abstract
</commit_message>
<xml_diff>
--- a/docs/Abstract-Epic/Abstract-Mapping-Swarm-Quadrotor-v0.docx
+++ b/docs/Abstract-Epic/Abstract-Mapping-Swarm-Quadrotor-v0.docx
@@ -1,6 +1,6 @@
 
 <file path=word/document.xml><?xml version="1.0" encoding="utf-8"?>
-<w:document xmlns:wpc="http://schemas.microsoft.com/office/word/2010/wordprocessingCanvas" xmlns:cx="http://schemas.microsoft.com/office/drawing/2014/chartex" xmlns:cx1="http://schemas.microsoft.com/office/drawing/2015/9/8/chartex" xmlns:cx2="http://schemas.microsoft.com/office/drawing/2015/10/21/chartex" xmlns:cx3="http://schemas.microsoft.com/office/drawing/2016/5/9/chartex" xmlns:cx4="http://schemas.microsoft.com/office/drawing/2016/5/10/chartex" xmlns:cx5="http://schemas.microsoft.com/office/drawing/2016/5/11/chartex" xmlns:cx6="http://schemas.microsoft.com/office/drawing/2016/5/12/chartex" xmlns:cx7="http://schemas.microsoft.com/office/drawing/2016/5/13/chartex" xmlns:cx8="http://schemas.microsoft.com/office/drawing/2016/5/14/chartex" xmlns:mc="http://schemas.openxmlformats.org/markup-compatibility/2006" xmlns:aink="http://schemas.microsoft.com/office/drawing/2016/ink" xmlns:am3d="http://schemas.microsoft.com/office/drawing/2017/model3d" xmlns:o="urn:schemas-microsoft-com:office:office" xmlns:oel="http://schemas.microsoft.com/office/2019/extlst" xmlns:r="http://schemas.openxmlformats.org/officeDocument/2006/relationships" xmlns:m="http://schemas.openxmlformats.org/officeDocument/2006/math" xmlns:v="urn:schemas-microsoft-com:vml" xmlns:wp14="http://schemas.microsoft.com/office/word/2010/wordprocessingDrawing" xmlns:wp="http://schemas.openxmlformats.org/drawingml/2006/wordprocessingDrawing" xmlns:w10="urn:schemas-microsoft-com:office:word" xmlns:w="http://schemas.openxmlformats.org/wordprocessingml/2006/main" xmlns:w14="http://schemas.microsoft.com/office/word/2010/wordml" xmlns:w15="http://schemas.microsoft.com/office/word/2012/wordml" xmlns:w16cex="http://schemas.microsoft.com/office/word/2018/wordml/cex" xmlns:w16cid="http://schemas.microsoft.com/office/word/2016/wordml/cid" xmlns:w16="http://schemas.microsoft.com/office/word/2018/wordml" xmlns:w16du="http://schemas.microsoft.com/office/word/2023/wordml/word16du" xmlns:w16sdtdh="http://schemas.microsoft.com/office/word/2020/wordml/sdtdatahash" xmlns:w16sdtfl="http://schemas.microsoft.com/office/word/2024/wordml/sdtformatlock" xmlns:w16se="http://schemas.microsoft.com/office/word/2015/wordml/symex" xmlns:wpg="http://schemas.microsoft.com/office/word/2010/wordprocessingGroup" xmlns:wpi="http://schemas.microsoft.com/office/word/2010/wordprocessingInk" xmlns:wne="http://schemas.microsoft.com/office/word/2006/wordml" xmlns:wps="http://schemas.microsoft.com/office/word/2010/wordprocessingShape" mc:Ignorable="w14 w15 w16se w16cid w16 w16cex w16sdtdh w16sdtfl w16du wp14">
+<w:document xmlns:wpc="http://schemas.microsoft.com/office/word/2010/wordprocessingCanvas" xmlns:cx="http://schemas.microsoft.com/office/drawing/2014/chartex" xmlns:cx1="http://schemas.microsoft.com/office/drawing/2015/9/8/chartex" xmlns:cx2="http://schemas.microsoft.com/office/drawing/2015/10/21/chartex" xmlns:cx3="http://schemas.microsoft.com/office/drawing/2016/5/9/chartex" xmlns:cx4="http://schemas.microsoft.com/office/drawing/2016/5/10/chartex" xmlns:cx5="http://schemas.microsoft.com/office/drawing/2016/5/11/chartex" xmlns:cx6="http://schemas.microsoft.com/office/drawing/2016/5/12/chartex" xmlns:cx7="http://schemas.microsoft.com/office/drawing/2016/5/13/chartex" xmlns:cx8="http://schemas.microsoft.com/office/drawing/2016/5/14/chartex" xmlns:mc="http://schemas.openxmlformats.org/markup-compatibility/2006" xmlns:aink="http://schemas.microsoft.com/office/drawing/2016/ink" xmlns:am3d="http://schemas.microsoft.com/office/drawing/2017/model3d" xmlns:o="urn:schemas-microsoft-com:office:office" xmlns:oel="http://schemas.microsoft.com/office/2019/extlst" xmlns:r="http://schemas.openxmlformats.org/officeDocument/2006/relationships" xmlns:m="http://schemas.openxmlformats.org/officeDocument/2006/math" xmlns:v="urn:schemas-microsoft-com:vml" xmlns:wp14="http://schemas.microsoft.com/office/word/2010/wordprocessingDrawing" xmlns:wp="http://schemas.openxmlformats.org/drawingml/2006/wordprocessingDrawing" xmlns:w10="urn:schemas-microsoft-com:office:word" xmlns:w="http://schemas.openxmlformats.org/wordprocessingml/2006/main" xmlns:w14="http://schemas.microsoft.com/office/word/2010/wordml" xmlns:w15="http://schemas.microsoft.com/office/word/2012/wordml" xmlns:w16cei="http://schemas.microsoft.com/office/word/2026/wordml/cei" xmlns:w16cex="http://schemas.microsoft.com/office/word/2018/wordml/cex" xmlns:w16cid="http://schemas.microsoft.com/office/word/2016/wordml/cid" xmlns:w16="http://schemas.microsoft.com/office/word/2018/wordml" xmlns:w16du="http://schemas.microsoft.com/office/word/2023/wordml/word16du" xmlns:w16sdtdh="http://schemas.microsoft.com/office/word/2020/wordml/sdtdatahash" xmlns:w16sdtfl="http://schemas.microsoft.com/office/word/2024/wordml/sdtformatlock" xmlns:w16se="http://schemas.microsoft.com/office/word/2015/wordml/symex" xmlns:wpg="http://schemas.microsoft.com/office/word/2010/wordprocessingGroup" xmlns:wpi="http://schemas.microsoft.com/office/word/2010/wordprocessingInk" xmlns:wne="http://schemas.microsoft.com/office/word/2006/wordml" xmlns:wps="http://schemas.microsoft.com/office/word/2010/wordprocessingShape" mc:Ignorable="w14 w15 w16se w16cid w16 w16cex w16sdtdh w16sdtfl w16du wp14">
   <w:body>
     <w:p>
       <w:pPr>
@@ -815,9 +815,9 @@
           <w:noProof/>
         </w:rPr>
         <w:drawing>
-          <wp:inline distT="0" distB="0" distL="0" distR="0" wp14:anchorId="35D1FBEC" wp14:editId="34624636">
-            <wp:extent cx="5313701" cy="4978400"/>
-            <wp:effectExtent l="0" t="0" r="1270" b="0"/>
+          <wp:inline distT="0" distB="0" distL="0" distR="0" wp14:anchorId="35D1FBEC" wp14:editId="1311BE1D">
+            <wp:extent cx="2340000" cy="2192347"/>
+            <wp:effectExtent l="0" t="0" r="3175" b="0"/>
             <wp:docPr id="2053012263" name="Picture 4"/>
             <wp:cNvGraphicFramePr>
               <a:graphicFrameLocks xmlns:a="http://schemas.openxmlformats.org/drawingml/2006/main" noChangeAspect="1"/>
@@ -847,7 +847,7 @@
                   <pic:spPr bwMode="auto">
                     <a:xfrm>
                       <a:off x="0" y="0"/>
-                      <a:ext cx="5412183" cy="5070668"/>
+                      <a:ext cx="2340000" cy="2192347"/>
                     </a:xfrm>
                     <a:prstGeom prst="rect">
                       <a:avLst/>
@@ -919,6 +919,30 @@
           <w:bCs/>
         </w:rPr>
         <w:t>ic mapping.</w:t>
+      </w:r>
+      <w:r>
+        <w:rPr>
+          <w:b w:val="0"/>
+          <w:bCs/>
+        </w:rPr>
+        <w:t xml:space="preserve"> (</w:t>
+      </w:r>
+      <w:hyperlink r:id="rId10" w:history="1">
+        <w:r>
+          <w:rPr>
+            <w:rStyle w:val="Hyperlink"/>
+            <w:b w:val="0"/>
+            <w:bCs/>
+          </w:rPr>
+          <w:t>https://github.com/izmaherdian/swarm-quadrotor-mapping/blob/main/docs/Diagram-Swarm-Quadrotor-Mapping.jpg</w:t>
+        </w:r>
+      </w:hyperlink>
+      <w:r>
+        <w:rPr>
+          <w:b w:val="0"/>
+          <w:bCs/>
+        </w:rPr>
+        <w:t>)</w:t>
       </w:r>
     </w:p>
     <w:p>
@@ -1067,7 +1091,6 @@
         </w:rPr>
       </w:pPr>
       <w:r>
-        <w:lastRenderedPageBreak/>
         <w:t>REFERENCES</w:t>
       </w:r>
     </w:p>
@@ -1362,7 +1385,7 @@
 </file>
 
 <file path=word/numbering.xml><?xml version="1.0" encoding="utf-8"?>
-<w:numbering xmlns:wpc="http://schemas.microsoft.com/office/word/2010/wordprocessingCanvas" xmlns:cx="http://schemas.microsoft.com/office/drawing/2014/chartex" xmlns:cx1="http://schemas.microsoft.com/office/drawing/2015/9/8/chartex" xmlns:cx2="http://schemas.microsoft.com/office/drawing/2015/10/21/chartex" xmlns:cx3="http://schemas.microsoft.com/office/drawing/2016/5/9/chartex" xmlns:cx4="http://schemas.microsoft.com/office/drawing/2016/5/10/chartex" xmlns:cx5="http://schemas.microsoft.com/office/drawing/2016/5/11/chartex" xmlns:cx6="http://schemas.microsoft.com/office/drawing/2016/5/12/chartex" xmlns:cx7="http://schemas.microsoft.com/office/drawing/2016/5/13/chartex" xmlns:cx8="http://schemas.microsoft.com/office/drawing/2016/5/14/chartex" xmlns:mc="http://schemas.openxmlformats.org/markup-compatibility/2006" xmlns:aink="http://schemas.microsoft.com/office/drawing/2016/ink" xmlns:am3d="http://schemas.microsoft.com/office/drawing/2017/model3d" xmlns:o="urn:schemas-microsoft-com:office:office" xmlns:oel="http://schemas.microsoft.com/office/2019/extlst" xmlns:r="http://schemas.openxmlformats.org/officeDocument/2006/relationships" xmlns:m="http://schemas.openxmlformats.org/officeDocument/2006/math" xmlns:v="urn:schemas-microsoft-com:vml" xmlns:wp14="http://schemas.microsoft.com/office/word/2010/wordprocessingDrawing" xmlns:wp="http://schemas.openxmlformats.org/drawingml/2006/wordprocessingDrawing" xmlns:w10="urn:schemas-microsoft-com:office:word" xmlns:w="http://schemas.openxmlformats.org/wordprocessingml/2006/main" xmlns:w14="http://schemas.microsoft.com/office/word/2010/wordml" xmlns:w15="http://schemas.microsoft.com/office/word/2012/wordml" xmlns:w16cex="http://schemas.microsoft.com/office/word/2018/wordml/cex" xmlns:w16cid="http://schemas.microsoft.com/office/word/2016/wordml/cid" xmlns:w16="http://schemas.microsoft.com/office/word/2018/wordml" xmlns:w16du="http://schemas.microsoft.com/office/word/2023/wordml/word16du" xmlns:w16sdtdh="http://schemas.microsoft.com/office/word/2020/wordml/sdtdatahash" xmlns:w16sdtfl="http://schemas.microsoft.com/office/word/2024/wordml/sdtformatlock" xmlns:w16se="http://schemas.microsoft.com/office/word/2015/wordml/symex" xmlns:wpg="http://schemas.microsoft.com/office/word/2010/wordprocessingGroup" xmlns:wpi="http://schemas.microsoft.com/office/word/2010/wordprocessingInk" xmlns:wne="http://schemas.microsoft.com/office/word/2006/wordml" xmlns:wps="http://schemas.microsoft.com/office/word/2010/wordprocessingShape" mc:Ignorable="w14 w15 w16se w16cid w16 w16cex w16sdtdh w16sdtfl w16du wp14">
+<w:numbering xmlns:wpc="http://schemas.microsoft.com/office/word/2010/wordprocessingCanvas" xmlns:cx="http://schemas.microsoft.com/office/drawing/2014/chartex" xmlns:cx1="http://schemas.microsoft.com/office/drawing/2015/9/8/chartex" xmlns:cx2="http://schemas.microsoft.com/office/drawing/2015/10/21/chartex" xmlns:cx3="http://schemas.microsoft.com/office/drawing/2016/5/9/chartex" xmlns:cx4="http://schemas.microsoft.com/office/drawing/2016/5/10/chartex" xmlns:cx5="http://schemas.microsoft.com/office/drawing/2016/5/11/chartex" xmlns:cx6="http://schemas.microsoft.com/office/drawing/2016/5/12/chartex" xmlns:cx7="http://schemas.microsoft.com/office/drawing/2016/5/13/chartex" xmlns:cx8="http://schemas.microsoft.com/office/drawing/2016/5/14/chartex" xmlns:mc="http://schemas.openxmlformats.org/markup-compatibility/2006" xmlns:aink="http://schemas.microsoft.com/office/drawing/2016/ink" xmlns:am3d="http://schemas.microsoft.com/office/drawing/2017/model3d" xmlns:o="urn:schemas-microsoft-com:office:office" xmlns:oel="http://schemas.microsoft.com/office/2019/extlst" xmlns:r="http://schemas.openxmlformats.org/officeDocument/2006/relationships" xmlns:m="http://schemas.openxmlformats.org/officeDocument/2006/math" xmlns:v="urn:schemas-microsoft-com:vml" xmlns:wp14="http://schemas.microsoft.com/office/word/2010/wordprocessingDrawing" xmlns:wp="http://schemas.openxmlformats.org/drawingml/2006/wordprocessingDrawing" xmlns:w10="urn:schemas-microsoft-com:office:word" xmlns:w="http://schemas.openxmlformats.org/wordprocessingml/2006/main" xmlns:w14="http://schemas.microsoft.com/office/word/2010/wordml" xmlns:w15="http://schemas.microsoft.com/office/word/2012/wordml" xmlns:w16cei="http://schemas.microsoft.com/office/word/2026/wordml/cei" xmlns:w16cex="http://schemas.microsoft.com/office/word/2018/wordml/cex" xmlns:w16cid="http://schemas.microsoft.com/office/word/2016/wordml/cid" xmlns:w16="http://schemas.microsoft.com/office/word/2018/wordml" xmlns:w16du="http://schemas.microsoft.com/office/word/2023/wordml/word16du" xmlns:w16sdtdh="http://schemas.microsoft.com/office/word/2020/wordml/sdtdatahash" xmlns:w16sdtfl="http://schemas.microsoft.com/office/word/2024/wordml/sdtformatlock" xmlns:w16se="http://schemas.microsoft.com/office/word/2015/wordml/symex" xmlns:wpg="http://schemas.microsoft.com/office/word/2010/wordprocessingGroup" xmlns:wpi="http://schemas.microsoft.com/office/word/2010/wordprocessingInk" xmlns:wne="http://schemas.microsoft.com/office/word/2006/wordml" xmlns:wps="http://schemas.microsoft.com/office/word/2010/wordprocessingShape" mc:Ignorable="w14 w15 w16se w16cid w16 w16cex w16sdtdh w16sdtfl w16du wp14">
   <w:abstractNum w:abstractNumId="0" w15:restartNumberingAfterBreak="0">
     <w:nsid w:val="104436C5"/>
     <w:multiLevelType w:val="multilevel"/>
@@ -3036,6 +3059,17 @@
     <w:unhideWhenUsed/>
     <w:rsid w:val="00182CFF"/>
   </w:style>
+  <w:style w:type="character" w:styleId="FollowedHyperlink">
+    <w:name w:val="FollowedHyperlink"/>
+    <w:basedOn w:val="DefaultParagraphFont"/>
+    <w:semiHidden/>
+    <w:unhideWhenUsed/>
+    <w:rsid w:val="00AC04A2"/>
+    <w:rPr>
+      <w:color w:val="800080" w:themeColor="followedHyperlink"/>
+      <w:u w:val="single"/>
+    </w:rPr>
+  </w:style>
 </w:styles>
 </file>
 
@@ -3217,6 +3251,12 @@
 </file>
 
 <file path=customXml/item1.xml><?xml version="1.0" encoding="utf-8"?>
+<p:properties xmlns:p="http://schemas.microsoft.com/office/2006/metadata/properties" xmlns:xsi="http://www.w3.org/2001/XMLSchema-instance" xmlns:pc="http://schemas.microsoft.com/office/infopath/2007/PartnerControls">
+  <documentManagement/>
+</p:properties>
+</file>
+
+<file path=customXml/item2.xml><?xml version="1.0" encoding="utf-8"?>
 <?mso-contentType ?>
 <FormTemplates xmlns="http://schemas.microsoft.com/sharepoint/v3/contenttype/forms">
   <Display>DocumentLibraryForm</Display>
@@ -3225,17 +3265,7 @@
 </FormTemplates>
 </file>
 
-<file path=customXml/item2.xml><?xml version="1.0" encoding="utf-8"?>
-<p:properties xmlns:p="http://schemas.microsoft.com/office/2006/metadata/properties" xmlns:xsi="http://www.w3.org/2001/XMLSchema-instance" xmlns:pc="http://schemas.microsoft.com/office/infopath/2007/PartnerControls">
-  <documentManagement/>
-</p:properties>
-</file>
-
 <file path=customXml/item3.xml><?xml version="1.0" encoding="utf-8"?>
-<b:Sources xmlns:b="http://schemas.openxmlformats.org/officeDocument/2006/bibliography" xmlns="http://schemas.openxmlformats.org/officeDocument/2006/bibliography" SelectedStyle="\APA.XSL" StyleName="APA"/>
-</file>
-
-<file path=customXml/item4.xml><?xml version="1.0" encoding="utf-8"?>
 <ct:contentTypeSchema xmlns:ct="http://schemas.microsoft.com/office/2006/metadata/contentType" xmlns:ma="http://schemas.microsoft.com/office/2006/metadata/properties/metaAttributes" ct:_="" ma:_="" ma:contentTypeName="Document" ma:contentTypeID="0x010100846995F60857E14C80FE53F9695AA2C6" ma:contentTypeVersion="7" ma:contentTypeDescription="Create a new document." ma:contentTypeScope="" ma:versionID="38c5f35686c3c4cec37769de32b93b97">
   <xsd:schema xmlns:xsd="http://www.w3.org/2001/XMLSchema" xmlns:xs="http://www.w3.org/2001/XMLSchema" xmlns:p="http://schemas.microsoft.com/office/2006/metadata/properties" xmlns:ns2="62f7b773-16dd-4b3c-b599-ed9bfcbd904f" xmlns:ns3="c3a8a8ca-00e5-416b-a184-163173e53f53" targetNamespace="http://schemas.microsoft.com/office/2006/metadata/properties" ma:root="true" ma:fieldsID="c7a00eb472d1264d625833f449ae8108" ns2:_="" ns3:_="">
     <xsd:import namespace="62f7b773-16dd-4b3c-b599-ed9bfcbd904f"/>
@@ -3420,15 +3450,11 @@
 </ct:contentTypeSchema>
 </file>
 
-<file path=customXml/itemProps1.xml><?xml version="1.0" encoding="utf-8"?>
-<ds:datastoreItem xmlns:ds="http://schemas.openxmlformats.org/officeDocument/2006/customXml" ds:itemID="{0844FC6D-7350-442F-8936-25B8D55E2C0C}">
-  <ds:schemaRefs>
-    <ds:schemaRef ds:uri="http://schemas.microsoft.com/sharepoint/v3/contenttype/forms"/>
-  </ds:schemaRefs>
-</ds:datastoreItem>
+<file path=customXml/item4.xml><?xml version="1.0" encoding="utf-8"?>
+<b:Sources xmlns:b="http://schemas.openxmlformats.org/officeDocument/2006/bibliography" xmlns="http://schemas.openxmlformats.org/officeDocument/2006/bibliography" SelectedStyle="\APA.XSL" StyleName="APA"/>
 </file>
 
-<file path=customXml/itemProps2.xml><?xml version="1.0" encoding="utf-8"?>
+<file path=customXml/itemProps1.xml><?xml version="1.0" encoding="utf-8"?>
 <ds:datastoreItem xmlns:ds="http://schemas.openxmlformats.org/officeDocument/2006/customXml" ds:itemID="{B23F62D3-EB58-423F-9DEC-FB3FD7A72760}">
   <ds:schemaRefs>
     <ds:schemaRef ds:uri="http://schemas.microsoft.com/office/2006/metadata/properties"/>
@@ -3437,15 +3463,15 @@
 </ds:datastoreItem>
 </file>
 
-<file path=customXml/itemProps3.xml><?xml version="1.0" encoding="utf-8"?>
-<ds:datastoreItem xmlns:ds="http://schemas.openxmlformats.org/officeDocument/2006/customXml" ds:itemID="{0697ED27-AAD2-43E1-AA38-35C328735191}">
+<file path=customXml/itemProps2.xml><?xml version="1.0" encoding="utf-8"?>
+<ds:datastoreItem xmlns:ds="http://schemas.openxmlformats.org/officeDocument/2006/customXml" ds:itemID="{0844FC6D-7350-442F-8936-25B8D55E2C0C}">
   <ds:schemaRefs>
-    <ds:schemaRef ds:uri="http://schemas.openxmlformats.org/officeDocument/2006/bibliography"/>
+    <ds:schemaRef ds:uri="http://schemas.microsoft.com/sharepoint/v3/contenttype/forms"/>
   </ds:schemaRefs>
 </ds:datastoreItem>
 </file>
 
-<file path=customXml/itemProps4.xml><?xml version="1.0" encoding="utf-8"?>
+<file path=customXml/itemProps3.xml><?xml version="1.0" encoding="utf-8"?>
 <ds:datastoreItem xmlns:ds="http://schemas.openxmlformats.org/officeDocument/2006/customXml" ds:itemID="{CF065601-3004-4BED-8BEF-2E59F4003D3F}">
   <ds:schemaRefs>
     <ds:schemaRef ds:uri="http://schemas.microsoft.com/office/2006/metadata/contentType"/>
@@ -3462,4 +3488,12 @@
     <ds:schemaRef ds:uri="http://schemas.microsoft.com/internal/obd"/>
   </ds:schemaRefs>
 </ds:datastoreItem>
+</file>
+
+<file path=customXml/itemProps4.xml><?xml version="1.0" encoding="utf-8"?>
+<ds:datastoreItem xmlns:ds="http://schemas.openxmlformats.org/officeDocument/2006/customXml" ds:itemID="{0697ED27-AAD2-43E1-AA38-35C328735191}">
+  <ds:schemaRefs>
+    <ds:schemaRef ds:uri="http://schemas.openxmlformats.org/officeDocument/2006/bibliography"/>
+  </ds:schemaRefs>
+</ds:datastoreItem>
 </file>
</xml_diff>